<commit_message>
Word paper with the three-seed results; fix duplicate seed table in LaTeX
The Word paper now carries the multi-seed study exactly as the LaTeX sections
on 506de48 word it: seed table read from paper/tables/multi_seed.tex (mean,
s.d., range, paired day-block bootstrap deltas), the seeds paragraph with the
GPU reproducibility check, both agent passes (24 LLM calls), and the updated
abstract, discussion, limitations and conclusion (abstract 245 words).

LaTeX: results.tex input tables/multi_seed twice (duplicate label), and
results_body.tex still said the study had not been run; both fixed and
main.pdf rebuilt.

Co-Authored-By: Claude Opus 5.5 (1M context) <noreply@anthropic.com>
Claude-Session: https://claude.ai/code/session_01UKAyPjXQRWjVWPVDNV1WWD
</commit_message>
<xml_diff>
--- a/paper/ieee_conference_paper.docx
+++ b/paper/ieee_conference_paper.docx
@@ -231,7 +231,7 @@
         <w:t xml:space="preserve">—</w:t>
       </w:r>
       <w:r>
-        <w:t xml:space="preserve">Urban traffic management needs forecasts that are accurate at several horizons, honest about their uncertainty and explainable enough to justify an intervention. This paper presents a research prototype for Manhattan that couples a context-gated graph attention and Transformer forecaster for 15-, 30- and 60-minute link-speed prediction with a retrieval-augmented, constraint-checked agentic workflow that drafts simulation-only signal-timing advisories. The forecaster runs on a directed road-link graph built from New York City real-time speed data, fuses weather, 311 and calendar context through an availability-aware gate, is calibrated with split conformal prediction and is explained with grouped Shapley values computed on the trained model. On nearly ten months of public data (1 January to 20 October 2026, 16 usable links) and a 44-day chronological test partition, the proposed model reaches a mean absolute error of 4.77, 5.33 and 6.15 mph at the three horizons, 7 to 16 percent below persistence and below both gradient-boosted baselines, but within 0.06 mph of a GRU and a temporal-only Transformer in a single-seed run. The availability gate helps, while operational weather features worsen accuracy. Conformal intervals reach 0.90 to 0.91 coverage overall but only 0.76 to 0.80 under congestion; a deterministic reliability gate defers 26 percent of forecasts and raises coverage on the rest to 0.93 to 0.95. Retrieval removed fabricated citations (three of three without it, none of nine with it). The SUMO controller comparison was not run because the simulation testbed failed its own baseline test, so no simulated gain is claimed.</w:t>
+        <w:t xml:space="preserve">Urban traffic management needs forecasts that are accurate at several horizons, honest about their uncertainty and explainable. We present a Manhattan prototype that couples a context-gated graph attention and Transformer forecaster for 15-, 30- and 60-minute link-speed prediction with a retrieval-augmented, constraint-checked agentic workflow that drafts simulation-only signal-timing advisories. The forecaster runs on a directed road-link graph of New York City real-time speeds, fuses weather, 311 and calendar context through an availability-aware gate, is calibrated with split conformal prediction and is explained with grouped Shapley values computed on the trained model. On nearly ten months of public data (1 January to 20 October 2026, 16 usable links) and a 44-day chronological test partition, the proposed model reaches a mean absolute error of 4.77, 5.33 and 6.15 mph at the three horizons, 7 to 16 percent below persistence and below both gradient-boosted baselines; over three seeds it is 0.03 to 0.08 mph below a temporal-only Transformer at every horizon and below a GRU at 30 and 60 minutes, while the GRU is better at 15 minutes. The availability gate helps, while operational weather features worsen accuracy. Conformal intervals reach 0.90 to 0.91 coverage overall but only 0.76 to 0.80 under congestion; a deterministic reliability gate defers 26 percent of forecasts and raises coverage on the rest to 0.93 to 0.95. Retrieval removed fabricated citations. The SUMO controller comparison was not run because the simulation testbed failed its own baseline test, so no simulated gain is claimed.</w:t>
       </w:r>
     </w:p>
     <w:p>
@@ -2886,13 +2886,13 @@
         <w:pStyle w:val="BodyText"/>
       </w:pPr>
       <w:r>
-        <w:t xml:space="preserve">To finish inside a fixed compute deadline, every deep model was trained with a recorded budget of 4,096 training windows per epoch, sampled afresh each epoch without replacement from the 50,415 training origins (about 8% of them), with early stopping on the mean validation MAE of a fixed validation subset (patience 5, at most 30 epochs) and one seed (42). The budget is identical for the GRU, the temporal Transformer, the proposed model and its ablations, and is stated here because it bounds how far each model was trained, not because it is a tuned hyper-parameter. Under it the proposed model stopped after 14 epochs (best epoch 8, 2.3 minutes on the GPU, 158,403 parameters), the temporal Transformer after 14 (best 8, 1.8 minutes), the GRU after 17 (best 11, 6.0 minutes, 41,667 parameters) and the no-weather ablation ran the full 30 epochs (best 24). A multi-seed study (seeds 42, 1 and 2 for the proposed model, the GRU and the temporal Transformer) is prepared but had not been run when this version was written (</w:t>
-      </w:r>
-      <w:r>
-        <w:t xml:space="preserve">Table IV</w:t>
-      </w:r>
-      <w:r>
-        <w:t xml:space="preserve">); every forecasting figure reported here is from seed 42 alone.</w:t>
+        <w:t xml:space="preserve">To finish inside a fixed compute deadline, every deep model was trained with a recorded budget of 4,096 training windows per epoch, sampled afresh each epoch without replacement from the 50,415 training origins (about 8% of them), with early stopping on the mean validation MAE of a fixed validation subset (patience 5, at most 30 epochs) and one seed (42). The budget is identical for the GRU, the temporal Transformer, the proposed model and its ablations, and is stated here because it bounds how far each model was trained, not because it is a tuned hyper-parameter. Under it the proposed model stopped after 14 epochs (best epoch 8, 2.3 minutes on the GPU, 158,403 parameters), the temporal Transformer after 14 (best 8, 1.8 minutes), the GRU after 17 (best 11, 6.0 minutes, 41,667 parameters) and the no-weather ablation ran the full 30 epochs (best 24). Figures in this subsection are from the seed-42 runs; the three-seed comparison of the deep models is in </w:t>
+      </w:r>
+      <w:r>
+        <w:t xml:space="preserve">Table III</w:t>
+      </w:r>
+      <w:r>
+        <w:t xml:space="preserve">.</w:t>
       </w:r>
     </w:p>
     <w:p>
@@ -4387,7 +4387,848 @@
         <w:pStyle w:val="BodyText"/>
       </w:pPr>
       <w:r>
-        <w:t xml:space="preserve">The margins between the three deep models are 0.01 to 0.06 mph, which a single seed cannot separate, so this paper does not claim that the proposed architecture forecasts better than a well-trained GRU or temporal Transformer on this sparse 16-link graph; it claims that it is comparably accurate (within 0.06 mph MAE of both at every horizon) while carrying the availability gate and the graph layer that the rest of the workflow uses. On the retrospective track (reanalysis weather plus collisions and permitted events, contextual analysis only) the proposed model reaches 4.67, 5.35 and 6.13 mph (</w:t>
+        <w:t xml:space="preserve">The margins between the three deep models are 0.01 to 0.06 mph, which a single seed cannot separate.</w:t>
+      </w:r>
+    </w:p>
+    <w:p>
+      <w:pPr>
+        <w:pStyle w:val="BodyText"/>
+      </w:pPr>
+      <w:r>
+        <w:rPr>
+          <w:i/>
+          <w:iCs/>
+        </w:rPr>
+        <w:t xml:space="preserve">Seeds:</w:t>
+      </w:r>
+      <w:r>
+        <w:t xml:space="preserve"> The three deep models were therefore retrained with seeds 42, 1 and 2 on the same GPU, data, budget and code (</w:t>
+      </w:r>
+      <w:r>
+        <w:t xml:space="preserve">Table III</w:t>
+      </w:r>
+      <w:r>
+        <w:t xml:space="preserve">; nine runs, each evaluated on one shared valid-target mask). Two checks came first. Re-running seed 42 reproduced the GRU and the temporal Transformer exactly (same stopping epoch and validation MAE to four decimals) but not the proposed model (25 epochs and validation MAE 5.358 against 14 and 5.388): the only difference between the proposed model and the temporal Transformer is the GATv2 layer, whose scatter operations on the GPU are not bit-reproducible, so on this hardware a fixed seed does not fix the proposed model. The same seed trained on a CPU in the development container stopped at a different epoch again (21 epochs, validation MAE 5.356; its predictions are not stored, so it is not part of the comparison). Over three seeds the proposed model has a seed-mean MAE of 4.69, 5.34 and 6.15 mph (standard deviation 0.06, 0.03 and 0.02 across seeds), the GRU 4.67, 5.37 and 6.18 and the temporal Transformer 4.72, 5.38 and 6.23.</w:t>
+      </w:r>
+    </w:p>
+    <w:p>
+      <w:pPr>
+        <w:pStyle w:val="tablehead"/>
+        <w:keepNext/>
+      </w:pPr>
+      <w:r>
+        <w:t xml:space="preserve">Deep Forecasters Over Three Seeds (Test MAE, mph)</w:t>
+      </w:r>
+    </w:p>
+    <w:tbl>
+      <w:tblPr>
+        <w:tblW w:w="243.30pt" w:type="dxa"/>
+        <w:jc w:val="center"/>
+        <w:tblBorders>
+          <w:top w:val="single" w:sz="2" w:space="0" w:color="auto"/>
+          <w:start w:val="single" w:sz="2" w:space="0" w:color="auto"/>
+          <w:bottom w:val="single" w:sz="2" w:space="0" w:color="auto"/>
+          <w:end w:val="single" w:sz="2" w:space="0" w:color="auto"/>
+          <w:insideH w:val="single" w:sz="2" w:space="0" w:color="auto"/>
+          <w:insideV w:val="single" w:sz="2" w:space="0" w:color="auto"/>
+        </w:tblBorders>
+        <w:tblLayout w:type="fixed"/>
+        <w:tblCellMar>
+          <w:start w:w="2pt" w:type="dxa"/>
+          <w:end w:w="2pt" w:type="dxa"/>
+        </w:tblCellMar>
+        <w:tblLook w:firstRow="1" w:lastRow="0" w:firstColumn="0" w:lastColumn="0" w:noHBand="1" w:noVBand="1"/>
+      </w:tblPr>
+      <w:tblGrid>
+        <w:gridCol w:w="1266"/>
+        <w:gridCol w:w="1200"/>
+        <w:gridCol w:w="1200"/>
+        <w:gridCol w:w="1200"/>
+      </w:tblGrid>
+      <w:tr>
+        <w:trPr>
+          <w:cantSplit/>
+          <w:tblHeader/>
+          <w:jc w:val="center"/>
+        </w:trPr>
+        <w:tc>
+          <w:tcPr>
+            <w:tcW w:w="63.30pt" w:type="dxa"/>
+            <w:vAlign w:val="center"/>
+          </w:tcPr>
+          <w:p>
+            <w:pPr>
+              <w:pStyle w:val="tablecolhead"/>
+              <w:keepNext/>
+              <w:jc w:val="center"/>
+            </w:pPr>
+            <w:r>
+              <w:rPr>
+                <w:b/>
+                <w:bCs/>
+                <w:sz w:val="13"/>
+                <w:szCs w:val="13"/>
+              </w:rPr>
+              <w:t xml:space="preserve">Model</w:t>
+            </w:r>
+          </w:p>
+        </w:tc>
+        <w:tc>
+          <w:tcPr>
+            <w:tcW w:w="60.00pt" w:type="dxa"/>
+            <w:vAlign w:val="center"/>
+          </w:tcPr>
+          <w:p>
+            <w:pPr>
+              <w:pStyle w:val="tablecolhead"/>
+              <w:keepNext/>
+              <w:jc w:val="center"/>
+            </w:pPr>
+            <w:r>
+              <w:rPr>
+                <w:b/>
+                <w:bCs/>
+                <w:sz w:val="13"/>
+                <w:szCs w:val="13"/>
+              </w:rPr>
+              <w:t xml:space="preserve">15 min</w:t>
+            </w:r>
+          </w:p>
+        </w:tc>
+        <w:tc>
+          <w:tcPr>
+            <w:tcW w:w="60.00pt" w:type="dxa"/>
+            <w:vAlign w:val="center"/>
+          </w:tcPr>
+          <w:p>
+            <w:pPr>
+              <w:pStyle w:val="tablecolhead"/>
+              <w:keepNext/>
+              <w:jc w:val="center"/>
+            </w:pPr>
+            <w:r>
+              <w:rPr>
+                <w:b/>
+                <w:bCs/>
+                <w:sz w:val="13"/>
+                <w:szCs w:val="13"/>
+              </w:rPr>
+              <w:t xml:space="preserve">30 min</w:t>
+            </w:r>
+          </w:p>
+        </w:tc>
+        <w:tc>
+          <w:tcPr>
+            <w:tcW w:w="60.00pt" w:type="dxa"/>
+            <w:vAlign w:val="center"/>
+          </w:tcPr>
+          <w:p>
+            <w:pPr>
+              <w:pStyle w:val="tablecolhead"/>
+              <w:keepNext/>
+              <w:jc w:val="center"/>
+            </w:pPr>
+            <w:r>
+              <w:rPr>
+                <w:b/>
+                <w:bCs/>
+                <w:sz w:val="13"/>
+                <w:szCs w:val="13"/>
+              </w:rPr>
+              <w:t xml:space="preserve">60 min</w:t>
+            </w:r>
+          </w:p>
+        </w:tc>
+      </w:tr>
+      <w:tr>
+        <w:trPr>
+          <w:cantSplit/>
+          <w:jc w:val="center"/>
+        </w:trPr>
+        <w:tc>
+          <w:tcPr>
+            <w:tcW w:w="63.30pt" w:type="dxa"/>
+            <w:vAlign w:val="center"/>
+          </w:tcPr>
+          <w:p>
+            <w:pPr>
+              <w:pStyle w:val="tablecopy"/>
+              <w:keepNext/>
+              <w:jc w:val="start"/>
+            </w:pPr>
+            <w:r>
+              <w:rPr>
+                <w:sz w:val="13"/>
+                <w:szCs w:val="13"/>
+              </w:rPr>
+              <w:t xml:space="preserve">Proposed (3 seeds)</w:t>
+            </w:r>
+          </w:p>
+        </w:tc>
+        <w:tc>
+          <w:tcPr>
+            <w:tcW w:w="60.00pt" w:type="dxa"/>
+            <w:vAlign w:val="center"/>
+          </w:tcPr>
+          <w:p>
+            <w:pPr>
+              <w:pStyle w:val="tablecopy"/>
+              <w:keepNext/>
+              <w:jc w:val="center"/>
+            </w:pPr>
+            <w:r>
+              <w:rPr>
+                <w:sz w:val="13"/>
+                <w:szCs w:val="13"/>
+              </w:rPr>
+              <w:t xml:space="preserve">4.688 ± 0.063</w:t>
+            </w:r>
+            <w:r>
+              <w:rPr>
+                <w:sz w:val="13"/>
+                <w:szCs w:val="13"/>
+              </w:rPr>
+              <w:br/>
+            </w:r>
+            <w:r>
+              <w:rPr>
+                <w:sz w:val="13"/>
+                <w:szCs w:val="13"/>
+              </w:rPr>
+              <w:t xml:space="preserve">[4.650, 4.760]</w:t>
+            </w:r>
+          </w:p>
+        </w:tc>
+        <w:tc>
+          <w:tcPr>
+            <w:tcW w:w="60.00pt" w:type="dxa"/>
+            <w:vAlign w:val="center"/>
+          </w:tcPr>
+          <w:p>
+            <w:pPr>
+              <w:pStyle w:val="tablecopy"/>
+              <w:keepNext/>
+              <w:jc w:val="center"/>
+            </w:pPr>
+            <w:r>
+              <w:rPr>
+                <w:sz w:val="13"/>
+                <w:szCs w:val="13"/>
+              </w:rPr>
+              <w:t xml:space="preserve">5.339 ± 0.032</w:t>
+            </w:r>
+            <w:r>
+              <w:rPr>
+                <w:sz w:val="13"/>
+                <w:szCs w:val="13"/>
+              </w:rPr>
+              <w:br/>
+            </w:r>
+            <w:r>
+              <w:rPr>
+                <w:sz w:val="13"/>
+                <w:szCs w:val="13"/>
+              </w:rPr>
+              <w:t xml:space="preserve">[5.302, 5.364]</w:t>
+            </w:r>
+          </w:p>
+        </w:tc>
+        <w:tc>
+          <w:tcPr>
+            <w:tcW w:w="60.00pt" w:type="dxa"/>
+            <w:vAlign w:val="center"/>
+          </w:tcPr>
+          <w:p>
+            <w:pPr>
+              <w:pStyle w:val="tablecopy"/>
+              <w:keepNext/>
+              <w:jc w:val="center"/>
+            </w:pPr>
+            <w:r>
+              <w:rPr>
+                <w:sz w:val="13"/>
+                <w:szCs w:val="13"/>
+              </w:rPr>
+              <w:t xml:space="preserve">6.153 ± 0.015</w:t>
+            </w:r>
+            <w:r>
+              <w:rPr>
+                <w:sz w:val="13"/>
+                <w:szCs w:val="13"/>
+              </w:rPr>
+              <w:br/>
+            </w:r>
+            <w:r>
+              <w:rPr>
+                <w:sz w:val="13"/>
+                <w:szCs w:val="13"/>
+              </w:rPr>
+              <w:t xml:space="preserve">[6.139, 6.170]</w:t>
+            </w:r>
+          </w:p>
+        </w:tc>
+      </w:tr>
+      <w:tr>
+        <w:trPr>
+          <w:cantSplit/>
+          <w:jc w:val="center"/>
+        </w:trPr>
+        <w:tc>
+          <w:tcPr>
+            <w:tcW w:w="63.30pt" w:type="dxa"/>
+            <w:vAlign w:val="center"/>
+          </w:tcPr>
+          <w:p>
+            <w:pPr>
+              <w:pStyle w:val="tablecopy"/>
+              <w:keepNext/>
+              <w:jc w:val="start"/>
+            </w:pPr>
+            <w:r>
+              <w:rPr>
+                <w:sz w:val="13"/>
+                <w:szCs w:val="13"/>
+              </w:rPr>
+              <w:t xml:space="preserve">GRU (3 seeds)</w:t>
+            </w:r>
+          </w:p>
+        </w:tc>
+        <w:tc>
+          <w:tcPr>
+            <w:tcW w:w="60.00pt" w:type="dxa"/>
+            <w:vAlign w:val="center"/>
+          </w:tcPr>
+          <w:p>
+            <w:pPr>
+              <w:pStyle w:val="tablecopy"/>
+              <w:keepNext/>
+              <w:jc w:val="center"/>
+            </w:pPr>
+            <w:r>
+              <w:rPr>
+                <w:sz w:val="13"/>
+                <w:szCs w:val="13"/>
+              </w:rPr>
+              <w:t xml:space="preserve">4.666 ± 0.057</w:t>
+            </w:r>
+            <w:r>
+              <w:rPr>
+                <w:sz w:val="13"/>
+                <w:szCs w:val="13"/>
+              </w:rPr>
+              <w:br/>
+            </w:r>
+            <w:r>
+              <w:rPr>
+                <w:sz w:val="13"/>
+                <w:szCs w:val="13"/>
+              </w:rPr>
+              <w:t xml:space="preserve">[4.604, 4.715]</w:t>
+            </w:r>
+          </w:p>
+        </w:tc>
+        <w:tc>
+          <w:tcPr>
+            <w:tcW w:w="60.00pt" w:type="dxa"/>
+            <w:vAlign w:val="center"/>
+          </w:tcPr>
+          <w:p>
+            <w:pPr>
+              <w:pStyle w:val="tablecopy"/>
+              <w:keepNext/>
+              <w:jc w:val="center"/>
+            </w:pPr>
+            <w:r>
+              <w:rPr>
+                <w:sz w:val="13"/>
+                <w:szCs w:val="13"/>
+              </w:rPr>
+              <w:t xml:space="preserve">5.370 ± 0.020</w:t>
+            </w:r>
+            <w:r>
+              <w:rPr>
+                <w:sz w:val="13"/>
+                <w:szCs w:val="13"/>
+              </w:rPr>
+              <w:br/>
+            </w:r>
+            <w:r>
+              <w:rPr>
+                <w:sz w:val="13"/>
+                <w:szCs w:val="13"/>
+              </w:rPr>
+              <w:t xml:space="preserve">[5.349, 5.389]</w:t>
+            </w:r>
+          </w:p>
+        </w:tc>
+        <w:tc>
+          <w:tcPr>
+            <w:tcW w:w="60.00pt" w:type="dxa"/>
+            <w:vAlign w:val="center"/>
+          </w:tcPr>
+          <w:p>
+            <w:pPr>
+              <w:pStyle w:val="tablecopy"/>
+              <w:keepNext/>
+              <w:jc w:val="center"/>
+            </w:pPr>
+            <w:r>
+              <w:rPr>
+                <w:sz w:val="13"/>
+                <w:szCs w:val="13"/>
+              </w:rPr>
+              <w:t xml:space="preserve">6.184 ± 0.010</w:t>
+            </w:r>
+            <w:r>
+              <w:rPr>
+                <w:sz w:val="13"/>
+                <w:szCs w:val="13"/>
+              </w:rPr>
+              <w:br/>
+            </w:r>
+            <w:r>
+              <w:rPr>
+                <w:sz w:val="13"/>
+                <w:szCs w:val="13"/>
+              </w:rPr>
+              <w:t xml:space="preserve">[6.174, 6.194]</w:t>
+            </w:r>
+          </w:p>
+        </w:tc>
+      </w:tr>
+      <w:tr>
+        <w:trPr>
+          <w:cantSplit/>
+          <w:jc w:val="center"/>
+        </w:trPr>
+        <w:tc>
+          <w:tcPr>
+            <w:tcW w:w="63.30pt" w:type="dxa"/>
+            <w:vAlign w:val="center"/>
+          </w:tcPr>
+          <w:p>
+            <w:pPr>
+              <w:pStyle w:val="tablecopy"/>
+              <w:keepNext/>
+              <w:jc w:val="start"/>
+            </w:pPr>
+            <w:r>
+              <w:rPr>
+                <w:sz w:val="13"/>
+                <w:szCs w:val="13"/>
+              </w:rPr>
+              <w:t xml:space="preserve">minus proposed (Δ)</w:t>
+            </w:r>
+          </w:p>
+        </w:tc>
+        <w:tc>
+          <w:tcPr>
+            <w:tcW w:w="60.00pt" w:type="dxa"/>
+            <w:vAlign w:val="center"/>
+          </w:tcPr>
+          <w:p>
+            <w:pPr>
+              <w:pStyle w:val="tablecopy"/>
+              <w:keepNext/>
+              <w:jc w:val="center"/>
+            </w:pPr>
+            <w:r>
+              <w:rPr>
+                <w:sz w:val="13"/>
+                <w:szCs w:val="13"/>
+              </w:rPr>
+              <w:t xml:space="preserve">Δ −0.021</w:t>
+            </w:r>
+            <w:r>
+              <w:rPr>
+                <w:sz w:val="13"/>
+                <w:szCs w:val="13"/>
+              </w:rPr>
+              <w:br/>
+            </w:r>
+            <w:r>
+              <w:rPr>
+                <w:sz w:val="13"/>
+                <w:szCs w:val="13"/>
+              </w:rPr>
+              <w:t xml:space="preserve">[−0.040, −0.004]</w:t>
+            </w:r>
+          </w:p>
+        </w:tc>
+        <w:tc>
+          <w:tcPr>
+            <w:tcW w:w="60.00pt" w:type="dxa"/>
+            <w:vAlign w:val="center"/>
+          </w:tcPr>
+          <w:p>
+            <w:pPr>
+              <w:pStyle w:val="tablecopy"/>
+              <w:keepNext/>
+              <w:jc w:val="center"/>
+            </w:pPr>
+            <w:r>
+              <w:rPr>
+                <w:sz w:val="13"/>
+                <w:szCs w:val="13"/>
+              </w:rPr>
+              <w:t xml:space="preserve">Δ +0.032</w:t>
+            </w:r>
+            <w:r>
+              <w:rPr>
+                <w:sz w:val="13"/>
+                <w:szCs w:val="13"/>
+              </w:rPr>
+              <w:br/>
+            </w:r>
+            <w:r>
+              <w:rPr>
+                <w:sz w:val="13"/>
+                <w:szCs w:val="13"/>
+              </w:rPr>
+              <w:t xml:space="preserve">[+0.010, +0.052]</w:t>
+            </w:r>
+          </w:p>
+        </w:tc>
+        <w:tc>
+          <w:tcPr>
+            <w:tcW w:w="60.00pt" w:type="dxa"/>
+            <w:vAlign w:val="center"/>
+          </w:tcPr>
+          <w:p>
+            <w:pPr>
+              <w:pStyle w:val="tablecopy"/>
+              <w:keepNext/>
+              <w:jc w:val="center"/>
+            </w:pPr>
+            <w:r>
+              <w:rPr>
+                <w:sz w:val="13"/>
+                <w:szCs w:val="13"/>
+              </w:rPr>
+              <w:t xml:space="preserve">Δ +0.031</w:t>
+            </w:r>
+            <w:r>
+              <w:rPr>
+                <w:sz w:val="13"/>
+                <w:szCs w:val="13"/>
+              </w:rPr>
+              <w:br/>
+            </w:r>
+            <w:r>
+              <w:rPr>
+                <w:sz w:val="13"/>
+                <w:szCs w:val="13"/>
+              </w:rPr>
+              <w:t xml:space="preserve">[+0.007, +0.056]</w:t>
+            </w:r>
+          </w:p>
+        </w:tc>
+      </w:tr>
+      <w:tr>
+        <w:trPr>
+          <w:cantSplit/>
+          <w:jc w:val="center"/>
+        </w:trPr>
+        <w:tc>
+          <w:tcPr>
+            <w:tcW w:w="63.30pt" w:type="dxa"/>
+            <w:vAlign w:val="center"/>
+          </w:tcPr>
+          <w:p>
+            <w:pPr>
+              <w:pStyle w:val="tablecopy"/>
+              <w:keepNext/>
+              <w:jc w:val="start"/>
+            </w:pPr>
+            <w:r>
+              <w:rPr>
+                <w:sz w:val="13"/>
+                <w:szCs w:val="13"/>
+              </w:rPr>
+              <w:t xml:space="preserve">Temporal Transf. (3 seeds)</w:t>
+            </w:r>
+          </w:p>
+        </w:tc>
+        <w:tc>
+          <w:tcPr>
+            <w:tcW w:w="60.00pt" w:type="dxa"/>
+            <w:vAlign w:val="center"/>
+          </w:tcPr>
+          <w:p>
+            <w:pPr>
+              <w:pStyle w:val="tablecopy"/>
+              <w:keepNext/>
+              <w:jc w:val="center"/>
+            </w:pPr>
+            <w:r>
+              <w:rPr>
+                <w:sz w:val="13"/>
+                <w:szCs w:val="13"/>
+              </w:rPr>
+              <w:t xml:space="preserve">4.723 ± 0.032</w:t>
+            </w:r>
+            <w:r>
+              <w:rPr>
+                <w:sz w:val="13"/>
+                <w:szCs w:val="13"/>
+              </w:rPr>
+              <w:br/>
+            </w:r>
+            <w:r>
+              <w:rPr>
+                <w:sz w:val="13"/>
+                <w:szCs w:val="13"/>
+              </w:rPr>
+              <w:t xml:space="preserve">[4.687, 4.749]</w:t>
+            </w:r>
+          </w:p>
+        </w:tc>
+        <w:tc>
+          <w:tcPr>
+            <w:tcW w:w="60.00pt" w:type="dxa"/>
+            <w:vAlign w:val="center"/>
+          </w:tcPr>
+          <w:p>
+            <w:pPr>
+              <w:pStyle w:val="tablecopy"/>
+              <w:keepNext/>
+              <w:jc w:val="center"/>
+            </w:pPr>
+            <w:r>
+              <w:rPr>
+                <w:sz w:val="13"/>
+                <w:szCs w:val="13"/>
+              </w:rPr>
+              <w:t xml:space="preserve">5.375 ± 0.033</w:t>
+            </w:r>
+            <w:r>
+              <w:rPr>
+                <w:sz w:val="13"/>
+                <w:szCs w:val="13"/>
+              </w:rPr>
+              <w:br/>
+            </w:r>
+            <w:r>
+              <w:rPr>
+                <w:sz w:val="13"/>
+                <w:szCs w:val="13"/>
+              </w:rPr>
+              <w:t xml:space="preserve">[5.338, 5.398]</w:t>
+            </w:r>
+          </w:p>
+        </w:tc>
+        <w:tc>
+          <w:tcPr>
+            <w:tcW w:w="60.00pt" w:type="dxa"/>
+            <w:vAlign w:val="center"/>
+          </w:tcPr>
+          <w:p>
+            <w:pPr>
+              <w:pStyle w:val="tablecopy"/>
+              <w:keepNext/>
+              <w:jc w:val="center"/>
+            </w:pPr>
+            <w:r>
+              <w:rPr>
+                <w:sz w:val="13"/>
+                <w:szCs w:val="13"/>
+              </w:rPr>
+              <w:t xml:space="preserve">6.233 ± 0.075</w:t>
+            </w:r>
+            <w:r>
+              <w:rPr>
+                <w:sz w:val="13"/>
+                <w:szCs w:val="13"/>
+              </w:rPr>
+              <w:br/>
+            </w:r>
+            <w:r>
+              <w:rPr>
+                <w:sz w:val="13"/>
+                <w:szCs w:val="13"/>
+              </w:rPr>
+              <w:t xml:space="preserve">[6.184, 6.320]</w:t>
+            </w:r>
+          </w:p>
+        </w:tc>
+      </w:tr>
+      <w:tr>
+        <w:trPr>
+          <w:cantSplit/>
+          <w:jc w:val="center"/>
+        </w:trPr>
+        <w:tc>
+          <w:tcPr>
+            <w:tcW w:w="63.30pt" w:type="dxa"/>
+            <w:vAlign w:val="center"/>
+          </w:tcPr>
+          <w:p>
+            <w:pPr>
+              <w:pStyle w:val="tablecopy"/>
+              <w:jc w:val="start"/>
+            </w:pPr>
+            <w:r>
+              <w:rPr>
+                <w:sz w:val="13"/>
+                <w:szCs w:val="13"/>
+              </w:rPr>
+              <w:t xml:space="preserve">minus proposed (Δ)</w:t>
+            </w:r>
+          </w:p>
+        </w:tc>
+        <w:tc>
+          <w:tcPr>
+            <w:tcW w:w="60.00pt" w:type="dxa"/>
+            <w:vAlign w:val="center"/>
+          </w:tcPr>
+          <w:p>
+            <w:pPr>
+              <w:pStyle w:val="tablecopy"/>
+              <w:jc w:val="center"/>
+            </w:pPr>
+            <w:r>
+              <w:rPr>
+                <w:sz w:val="13"/>
+                <w:szCs w:val="13"/>
+              </w:rPr>
+              <w:t xml:space="preserve">Δ +0.035</w:t>
+            </w:r>
+            <w:r>
+              <w:rPr>
+                <w:sz w:val="13"/>
+                <w:szCs w:val="13"/>
+              </w:rPr>
+              <w:br/>
+            </w:r>
+            <w:r>
+              <w:rPr>
+                <w:sz w:val="13"/>
+                <w:szCs w:val="13"/>
+              </w:rPr>
+              <w:t xml:space="preserve">[+0.019, +0.051]</w:t>
+            </w:r>
+          </w:p>
+        </w:tc>
+        <w:tc>
+          <w:tcPr>
+            <w:tcW w:w="60.00pt" w:type="dxa"/>
+            <w:vAlign w:val="center"/>
+          </w:tcPr>
+          <w:p>
+            <w:pPr>
+              <w:pStyle w:val="tablecopy"/>
+              <w:jc w:val="center"/>
+            </w:pPr>
+            <w:r>
+              <w:rPr>
+                <w:sz w:val="13"/>
+                <w:szCs w:val="13"/>
+              </w:rPr>
+              <w:t xml:space="preserve">Δ +0.037</w:t>
+            </w:r>
+            <w:r>
+              <w:rPr>
+                <w:sz w:val="13"/>
+                <w:szCs w:val="13"/>
+              </w:rPr>
+              <w:br/>
+            </w:r>
+            <w:r>
+              <w:rPr>
+                <w:sz w:val="13"/>
+                <w:szCs w:val="13"/>
+              </w:rPr>
+              <w:t xml:space="preserve">[+0.018, +0.054]</w:t>
+            </w:r>
+          </w:p>
+        </w:tc>
+        <w:tc>
+          <w:tcPr>
+            <w:tcW w:w="60.00pt" w:type="dxa"/>
+            <w:vAlign w:val="center"/>
+          </w:tcPr>
+          <w:p>
+            <w:pPr>
+              <w:pStyle w:val="tablecopy"/>
+              <w:jc w:val="center"/>
+            </w:pPr>
+            <w:r>
+              <w:rPr>
+                <w:sz w:val="13"/>
+                <w:szCs w:val="13"/>
+              </w:rPr>
+              <w:t xml:space="preserve">Δ +0.080</w:t>
+            </w:r>
+            <w:r>
+              <w:rPr>
+                <w:sz w:val="13"/>
+                <w:szCs w:val="13"/>
+              </w:rPr>
+              <w:br/>
+            </w:r>
+            <w:r>
+              <w:rPr>
+                <w:sz w:val="13"/>
+                <w:szCs w:val="13"/>
+              </w:rPr>
+              <w:t xml:space="preserve">[+0.054, +0.104]</w:t>
+            </w:r>
+          </w:p>
+        </w:tc>
+      </w:tr>
+    </w:tbl>
+    <w:p>
+      <w:pPr>
+        <w:pStyle w:val="tablecopy"/>
+        <w:spacing w:before="3pt" w:after="8pt"/>
+      </w:pPr>
+      <w:r>
+        <w:rPr>
+          <w:i/>
+          <w:iCs/>
+          <w:sz w:val="14"/>
+          <w:szCs w:val="14"/>
+        </w:rPr>
+        <w:t xml:space="preserve">Note:</w:t>
+      </w:r>
+      <w:r>
+        <w:rPr>
+          <w:sz w:val="14"/>
+          <w:szCs w:val="14"/>
+        </w:rPr>
+        <w:t xml:space="preserve"> Mean ± s.d. [min, max] over seeds 1, 2 and 42 (same GPU, data, budget and code). Δ rows: paired day-block bootstrap of the seed-averaged MAE difference to the proposed model, 95% interval; positive means the proposed model is lower. Test period 2026-09-06 09:00:00 .. 2026-10-20 04:00:00 UTC; </w:t>
+      </w:r>
+      <w:r>
+        <w:rPr>
+          <w:i/>
+          <w:iCs/>
+          <w:sz w:val="14"/>
+          <w:szCs w:val="14"/>
+        </w:rPr>
+        <w:t xml:space="preserve">n</w:t>
+      </w:r>
+      <w:r>
+        <w:rPr>
+          <w:sz w:val="14"/>
+          <w:szCs w:val="14"/>
+        </w:rPr>
+        <w:t xml:space="preserve"> = 144,205 valid 60-min targets.</w:t>
+      </w:r>
+    </w:p>
+    <w:p>
+      <w:pPr>
+        <w:pStyle w:val="BodyText"/>
+      </w:pPr>
+      <w:r>
+        <w:t xml:space="preserve">A paired day-block bootstrap (44 test days) of the seed-averaged MAE difference puts the proposed model below the temporal Transformer at every horizon (by 0.035, 0.037 and 0.080 mph, intervals excluding zero) and below the GRU at 30 and 60 minutes (0.032 and 0.031 mph, intervals [0.010, 0.052] and [0.007, 0.056]), while the GRU is lower at 15 minutes (by 0.021 mph, [0.004, 0.040]). These intervals describe day-to-day variation of the test errors for the seed-averaged models; with three seeds they do not estimate between-seed variance, the per-seed ranges overlap, and one temporal-Transformer seed stopped at epoch 2, which raises that model’s 60-minute mean. The supported reading is therefore narrow: the proposed model is at least as accurate as both deep baselines and has a small, consistent advantage of 0.03–0.08 mph at 30 and 60 minutes, while the GRU is the better 15-minute forecaster; it is not a demonstration that graph attention is decisive on this sparse 16-link network.</w:t>
+      </w:r>
+    </w:p>
+    <w:p>
+      <w:pPr>
+        <w:pStyle w:val="BodyText"/>
+      </w:pPr>
+      <w:r>
+        <w:t xml:space="preserve">On the retrospective track (reanalysis weather plus collisions and permitted events, contextual analysis only) the proposed model reaches 4.67, 5.35 and 6.13 mph (</w:t>
       </w:r>
       <w:r>
         <w:t xml:space="preserve">Table II</w:t>
@@ -4422,7 +5263,7 @@
         <w:t xml:space="preserve"> </w:t>
       </w:r>
       <w:r>
-        <w:t xml:space="preserve">Table III</w:t>
+        <w:t xml:space="preserve">Table IV</w:t>
       </w:r>
       <w:r>
         <w:t xml:space="preserve"> reports the mean MAE over the three horizons and a paired day-block bootstrap (1,000 resamples, the code default, of the 44 test days that contain a valid paired target; 95% percentile interval) of the difference to the proposed model (5.419 mph). Removing the availability gate (plain concatenation) raises MAE by 0.067 mph ([0.048, 0.086]); removing the 311 infrastructure group raises it by 0.014 mph ([0.002, 0.026]); removing the operational weather forecasts </w:t>
@@ -5104,115 +5945,6 @@
     </w:p>
     <w:p>
       <w:pPr>
-        <w:pStyle w:val="tablehead"/>
-        <w:keepNext/>
-      </w:pPr>
-      <w:r>
-        <w:t xml:space="preserve">Multi-Seed Study of the Deep Forecasters (Test MAE, mph)</w:t>
-      </w:r>
-    </w:p>
-    <w:tbl>
-      <w:tblPr>
-        <w:tblW w:w="180.00pt" w:type="dxa"/>
-        <w:jc w:val="center"/>
-        <w:tblBorders>
-          <w:top w:val="single" w:sz="2" w:space="0" w:color="auto"/>
-          <w:start w:val="single" w:sz="2" w:space="0" w:color="auto"/>
-          <w:bottom w:val="single" w:sz="2" w:space="0" w:color="auto"/>
-          <w:end w:val="single" w:sz="2" w:space="0" w:color="auto"/>
-          <w:insideH w:val="single" w:sz="2" w:space="0" w:color="auto"/>
-          <w:insideV w:val="single" w:sz="2" w:space="0" w:color="auto"/>
-        </w:tblBorders>
-        <w:tblLayout w:type="fixed"/>
-        <w:tblCellMar>
-          <w:start w:w="2pt" w:type="dxa"/>
-          <w:end w:w="2pt" w:type="dxa"/>
-        </w:tblCellMar>
-        <w:tblLook w:firstRow="1" w:lastRow="0" w:firstColumn="0" w:lastColumn="0" w:noHBand="1" w:noVBand="1"/>
-      </w:tblPr>
-      <w:tblGrid>
-        <w:gridCol w:w="3600"/>
-      </w:tblGrid>
-      <w:tr>
-        <w:trPr>
-          <w:cantSplit/>
-          <w:tblHeader/>
-          <w:jc w:val="center"/>
-        </w:trPr>
-        <w:tc>
-          <w:tcPr>
-            <w:tcW w:w="180.00pt" w:type="dxa"/>
-            <w:vAlign w:val="center"/>
-          </w:tcPr>
-          <w:p>
-            <w:pPr>
-              <w:pStyle w:val="tablecolhead"/>
-              <w:keepNext/>
-              <w:jc w:val="center"/>
-            </w:pPr>
-            <w:r>
-              <w:rPr>
-                <w:b/>
-                <w:bCs/>
-                <w:sz w:val="16"/>
-                <w:szCs w:val="16"/>
-              </w:rPr>
-              <w:t xml:space="preserve">Status</w:t>
-            </w:r>
-          </w:p>
-        </w:tc>
-      </w:tr>
-      <w:tr>
-        <w:trPr>
-          <w:cantSplit/>
-          <w:jc w:val="center"/>
-        </w:trPr>
-        <w:tc>
-          <w:tcPr>
-            <w:tcW w:w="180.00pt" w:type="dxa"/>
-            <w:vAlign w:val="center"/>
-          </w:tcPr>
-          <w:p>
-            <w:pPr>
-              <w:pStyle w:val="tablecopy"/>
-              <w:keepNext/>
-              <w:jc w:val="start"/>
-            </w:pPr>
-            <w:r>
-              <w:rPr>
-                <w:sz w:val="16"/>
-                <w:szCs w:val="16"/>
-              </w:rPr>
-              <w:t xml:space="preserve">NOT RUN</w:t>
-            </w:r>
-          </w:p>
-        </w:tc>
-      </w:tr>
-    </w:tbl>
-    <w:p>
-      <w:pPr>
-        <w:pStyle w:val="tablecopy"/>
-        <w:spacing w:before="3pt" w:after="8pt"/>
-      </w:pPr>
-      <w:r>
-        <w:rPr>
-          <w:i/>
-          <w:iCs/>
-          <w:sz w:val="14"/>
-          <w:szCs w:val="14"/>
-        </w:rPr>
-        <w:t xml:space="preserve">Note:</w:t>
-      </w:r>
-      <w:r>
-        <w:rPr>
-          <w:sz w:val="14"/>
-          <w:szCs w:val="14"/>
-        </w:rPr>
-        <w:t xml:space="preserve"> Seeds 42, 1 and 2 for the proposed model, the GRU and the temporal Transformer; mean ± sd over seeds and a paired day-block bootstrap of the seed-averaged difference to the proposed model will be reported here once the study has run.</w:t>
-      </w:r>
-    </w:p>
-    <w:p>
-      <w:pPr>
         <w:pStyle w:val="Heading2"/>
       </w:pPr>
       <w:r>
@@ -6071,7 +6803,7 @@
         <w:t xml:space="preserve">Table VII</w:t>
       </w:r>
       <w:r>
-        <w:t xml:space="preserve"> lists all 19 policy-by-case runs (REPLAY mode on test-partition forecast origins). The deterministic gates fired as designed (the three stress cases were run under the full system only, the rainy period under every policy): the stale-data stress case (inputs aged six steps) ended in DEFER_​DATA, the wide-interval stress case (forced 99 mph width) and the observed rainy period, whose intervals of 44–46 mph exceed the 38.1 mph cap, in DEFER_​UNCERTAINTY, and the out-of-scope query in DEFER_​EVIDENCE, each without an LLM call. The model was called 12 times (one attempt each, 892 to 3,604 prompt tokens, 157 to 278 completion tokens, 15 to 126 s per call with the first, cold call slowest) and returned schema-valid JSON every time (</w:t>
+        <w:t xml:space="preserve"> lists all 19 policy-by-case runs (REPLAY mode on test-partition forecast origins). The deterministic gates fired as designed (the three stress cases were run under the full system only, the rainy period under every policy): the stale-data stress case (inputs aged six steps) ended in DEFER_​DATA, the wide-interval stress case (forced 99 mph width) and the observed rainy period, whose intervals of 44–46 mph exceed the 38.1 mph cap, in DEFER_​UNCERTAINTY, and the out-of-scope query in DEFER_​EVIDENCE, each without an LLM call. The model was called 12 times per pass, and the stage was run twice (2026-10-20 and, after the simulation-gate correction, 2026-10-21): 24 calls, one attempt each, 892 to 3,619 prompt tokens, 157 to 321 completion tokens and 15 to 126 s per call (the first, cold call slowest; 18 to 52 s in the second pass), all returning schema-valid JSON and all recommending monitoring only (</w:t>
       </w:r>
       <w:r>
         <w:rPr>
@@ -6082,7 +6814,7 @@
         <w:t xml:space="preserve">reports/​experiments/​llm_​calls.csv</w:t>
       </w:r>
       <w:r>
-        <w:t xml:space="preserve">).</w:t>
+        <w:t xml:space="preserve">). Both passes reached the same 19 decisions.</w:t>
       </w:r>
     </w:p>
     <w:p>
@@ -8568,7 +9300,7 @@
         <w:pStyle w:val="BodyText"/>
       </w:pPr>
       <w:r>
-        <w:t xml:space="preserve">Without retrieval the model cited an evidence id that does not exist in all three cases (for example </w:t>
+        <w:t xml:space="preserve">Without retrieval the model cited an evidence id that does not exist in all three cases of each pass (for example </w:t>
       </w:r>
       <w:r>
         <w:rPr>
@@ -8579,7 +9311,7 @@
         <w:t xml:space="preserve">EVIDENCE_​123456</w:t>
       </w:r>
       <w:r>
-        <w:t xml:space="preserve">), and the citation check rejected all three; with retrieval, no invalid citation occurred in nine calls. On the routine rush-hour case (FDR S Catherine Slip–Brooklyn Bridge, a link without a reviewed DOT-to-SUMO mapping) the constraint layer rejected the candidate under every policy that keeps it, while the RAG-without-constraints policy passed the same candidate to human review. On the two cases on the mapped West Street link the model recommended monitoring only, which passes all 13 checks (pedestrian protection NOT_​EVALUATED) and ends in PENDING_​HUMAN_​REVIEW; because no signal change was proposed, the simulation gate was never invoked by a real advisory and the SIMULATION_​PASSED path remains exercised only by the software tests. End-to-end latency is 19 to 30 s per advisory after the first call.</w:t>
+        <w:t xml:space="preserve">), and the citation check rejected every one; with retrieval, no invalid citation occurred in nine calls per pass. On the routine rush-hour case (FDR S Catherine Slip–Brooklyn Bridge, a link without a reviewed DOT-to-SUMO mapping) the constraint layer rejected the candidate under every policy that keeps it, while the RAG-without-constraints policy passed the same candidate to human review. On the two cases on the mapped West Street link the model recommended monitoring only, which passes all 13 checks (pedestrian protection NOT_​EVALUATED) and ends in PENDING_​HUMAN_​REVIEW; because no signal change was proposed, the simulation gate was never invoked by a real advisory and the SIMULATION_​PASSED path remains exercised only by the software tests. End-to-end latency is 19 to 30 s per advisory after the first call.</w:t>
       </w:r>
     </w:p>
     <w:p>
@@ -12318,7 +13050,7 @@
         <w:t xml:space="preserve">Forecasting:</w:t>
       </w:r>
       <w:r>
-        <w:t xml:space="preserve"> The accuracy gain of the proposed model over persistence (7–16% MAE) is real and consistent across horizons, its margin over the tree baselines is consistent in sign (0.05–0.25 mph) though at 15 min no larger than the GRU margin, and its margin over the GRU and the temporal-only Transformer is within what a single seed can resolve. Two measured facts explain why the spatial layer adds little here: the graph is sparse (16 nodes with usable data, most of them limited-access highway segments whose monitored neighbours are kilometres away) and the explanations attribute 0.52 mph of mean absolute effect to neighbour traffic against 8.22 mph to the link’s own last half hour. The neighbour-removal analysis shows the layer is not inert (prediction changes of 0.7–1.3 mph on four of the five connected links, none on the fifth) but also that removing edges sometimes lowers the error, so on this network message passing is a modest and mixed contribution. The availability gate is the component the ablations do support: removing it costs 0.067 mph with an interval that excludes zero.</w:t>
+        <w:t xml:space="preserve"> The accuracy gain of the proposed model over persistence (7–16% MAE) is real and consistent across horizons, and its margin over the tree baselines is consistent in sign (0.05–0.25 mph) though at 15 min no larger than the GRU margin. Over three seeds its margin over the temporal-only Transformer (0.04–0.08 mph) and over the GRU at 30 and 60 minutes (0.03 mph) is consistent across test days, while the GRU is better at 15 minutes; these are small effects from three seeds, not a decisive architectural advantage. Two measured facts explain why the spatial layer adds little here: the graph is sparse (16 nodes with usable data, most of them limited-access highway segments whose monitored neighbours are kilometres away) and the explanations attribute 0.52 mph of mean absolute effect to neighbour traffic against 8.22 mph to the link’s own last half hour. The neighbour-removal analysis shows the layer is not inert (prediction changes of 0.7–1.3 mph on four of the five connected links, none on the fifth) but also that removing edges sometimes lowers the error, so on this network message passing is a modest and mixed contribution. The availability gate is the component the ablations do support: removing it costs 0.067 mph with an interval that excludes zero.</w:t>
       </w:r>
     </w:p>
     <w:p>
@@ -12431,7 +13163,13 @@
         <w:t xml:space="preserve">Modelling and evaluation:</w:t>
       </w:r>
       <w:r>
-        <w:t xml:space="preserve"> All deep models were trained under a recorded budget of 4,096 windows per epoch with early stopping, one seed and one chronological split; the only variance estimate is a day-block bootstrap on paired differences, and the proposed model’s margin over the GRU and temporal Transformer is inside what seeds could change. The multi-seed study that would measure this is not yet run. Split conformal intervals carry a marginal guarantee under exchangeability, which traffic series violate; the measured coverage under congestion is 0.76–0.80. Explanations describe the trained model, with a background drawn from the training partition; neighbour sensitivity perturbs the graph in ways the model never saw during training, and only incoming edges can change a link’s own prediction.</w:t>
+        <w:t xml:space="preserve"> All deep models were trained under a recorded budget of 4,096 windows per epoch with early stopping and one chronological split. The three deep models were compared over only three seeds (</w:t>
+      </w:r>
+      <w:r>
+        <w:t xml:space="preserve">Table III</w:t>
+      </w:r>
+      <w:r>
+        <w:t xml:space="preserve">); the day-block bootstrap describes test-day variation of the seed-averaged errors and does not estimate between-seed variance, and the per-seed ranges overlap. On the GPU the proposed model is not bit-reproducible at a fixed seed (GATv2 scatter operations), whereas the GRU and temporal Transformer are; a reported proposed-model run can therefore be re-trained but not re-created exactly. Split conformal intervals carry a marginal guarantee under exchangeability, which traffic series violate; the measured coverage under congestion is 0.76–0.80. Explanations describe the trained model, with a background drawn from the training partition; neighbour sensitivity perturbs the graph in ways the model never saw during training, and only incoming edges can change a link’s own prediction.</w:t>
       </w:r>
     </w:p>
     <w:p>
@@ -12514,7 +13252,7 @@
         <w:pStyle w:val="BodyText"/>
       </w:pPr>
       <w:r>
-        <w:t xml:space="preserve">We presented a complete, reproducible prototype that joins multi-horizon graph-Transformer forecasting, conformal calibration, model-faithful explanations, allow-listed retrieval, a locally hosted language model constrained by deterministic checks, and matched-seed simulation into one auditable advisory workflow on public New York City data, and we ran it end to end on nearly ten months of real DOT speeds. The measured outcome is mixed and reported as such: the proposed forecaster beats persistence by 7–16% MAE and the tree baselines at every horizon, but not the GRU or temporal Transformer by a margin a single seed can establish; the availability gate helps and the operational weather features hurt; conformal intervals hold their marginal coverage but under-cover congestion; retrieval removes fabricated citations and the constraint layer, not the model, decides admissibility; no advisory reached the simulation gate because the model chose monitoring on the mapped corridor; and no controller comparison is established, because an audit of the simulation testbed found that the first comparison let SUMO divert half of the corridor traffic and that, once corrected, the modelled corridor cannot serve the observed West Street volume within its baseline test, with generated or Webster re-timed signal programs.</w:t>
+        <w:t xml:space="preserve">We presented a complete, reproducible prototype that joins multi-horizon graph-Transformer forecasting, conformal calibration, model-faithful explanations, allow-listed retrieval, a locally hosted language model constrained by deterministic checks, and matched-seed simulation into one auditable advisory workflow on public New York City data, and we ran it end to end on nearly ten months of real DOT speeds. The measured outcome is mixed and reported as such: the proposed forecaster beats persistence by 7–16% MAE and the tree baselines at every horizon, and over three seeds it is 0.03–0.08 mph below the temporal Transformer at every horizon and the GRU at 30 and 60 minutes, with the GRU better at 15 minutes, a small advantage rather than a decisive one; the availability gate helps and the operational weather features hurt; conformal intervals hold their marginal coverage but under-cover congestion; retrieval removes fabricated citations and the constraint layer, not the model, decides admissibility; no advisory reached the simulation gate because the model chose monitoring on the mapped corridor; and no controller comparison is established, because an audit of the simulation testbed found that the first comparison let SUMO divert half of the corridor traffic and that, once corrected, the modelled corridor cannot serve the observed West Street volume within its baseline test, with generated or Webster re-timed signal programs.</w:t>
       </w:r>
     </w:p>
     <w:p>
@@ -12522,7 +13260,7 @@
         <w:pStyle w:val="BodyText"/>
       </w:pPr>
       <w:r>
-        <w:t xml:space="preserve">Future work, in the order the evidence suggests, is multi-seed training without the compute budget, congestion-conditional calibration, a denser sensor network on which the spatial layer can matter, calibrating the simulation testbed’s signal splits and progression to the observed 10.95 mph PM-peak speed (or obtaining NYC DOT timing plans), pedestrian modelling, and an externally reviewed retrieval benchmark.</w:t>
+        <w:t xml:space="preserve">Future work, in the order the evidence suggests, is training with more seeds and without the compute budget, congestion-conditional calibration, a denser sensor network on which the spatial layer can matter, calibrating the simulation testbed’s signal splits and progression to the observed 10.95 mph PM-peak speed (or obtaining NYC DOT timing plans), pedestrian modelling, and an externally reviewed retrieval benchmark.</w:t>
       </w:r>
     </w:p>
     <w:p>

</xml_diff>

<commit_message>
Word paper: protocol v5 signal-split calibration paragraph and table
Co-Authored-By: Claude Opus 5.5 (1M context) <noreply@anthropic.com>
Claude-Session: https://claude.ai/code/session_01UKAyPjXQRWjVWPVDNV1WWD
</commit_message>
<xml_diff>
--- a/paper/ieee_conference_paper.docx
+++ b/paper/ieee_conference_paper.docx
@@ -12987,6 +12987,1112 @@
       </w:r>
       <w:r>
         <w:t xml:space="preserve"> also show West Street from Battery Place to West 57th Street re-timed for 25 mph signal progression in 2014 and 2019, whereas the testbed’s programs are uncoordinated. The controller comparison therefore remains NOT RUN; the observed speed is now an explicit calibration target for signal splits and progression, or for NYC DOT timing plans if they can be obtained.</w:t>
+      </w:r>
+    </w:p>
+    <w:p>
+      <w:pPr>
+        <w:pStyle w:val="BodyText"/>
+      </w:pPr>
+      <w:r>
+        <w:rPr>
+          <w:i/>
+          <w:iCs/>
+        </w:rPr>
+        <w:t xml:space="preserve">Signal-split calibration (protocol v5).</w:t>
+      </w:r>
+      <w:r>
+        <w:t xml:space="preserve"> We therefore fixed, before running anything, a calibration protocol for the one testbed input that is a declared assumption rather than an observation: the signal programs. Starting from the Webster plan for the 2025 counts without side-street demand, the corridor green of every corridor signal is scaled by a factor from a fixed grid (1.0 to 2.5), other greens are shortened down to 7 s, cycles are kept at or below 120 s and corridor greens at or below 90 s, and phase states are unchanged; each factor is run under the fixed-time baseline on the three development seeds, and among the factors that pass the unchanged admissibility rule on every seed the one whose seed-mean space-mean speed on the mapped link is closest to the observed 10.95 mph is selected if it lies within 1.5 mph. The workstation ran this protocol on 23 October 2026 (</w:t>
+      </w:r>
+      <w:r>
+        <w:t xml:space="preserve">Table X</w:t>
+      </w:r>
+      <w:r>
+        <w:t xml:space="preserve">; </w:t>
+      </w:r>
+      <w:r>
+        <w:rPr>
+          <w:rFonts w:ascii="Courier New" w:hAnsi="Courier New" w:cs="Courier New"/>
+          <w:sz w:val="18"/>
+          <w:szCs w:val="18"/>
+        </w:rPr>
+        <w:t xml:space="preserve">split_​calibration_​v5_​counts2025_​calibrated_​splits.json</w:t>
+      </w:r>
+      <w:r>
+        <w:t xml:space="preserve">). Widening the corridor green raises the simulated speed monotonically, from 5.82 mph at factor 1.0 (which reproduces the earlier 5.79–5.85 mph audit) to 8.10 mph at 2.5, and clears the unfinished trips: factors 2.0 and 2.5 are admissible (1/0/28 and 0/0/0 unfinished of 5,368, no teleports), the smaller ones are not. The closest admissible factor is still 2.85 mph below the target, beyond the tolerance, so no program is selected and the controller comparison, the agent re-run on a calibrated testbed and the dependent exports were not run. Speed was still rising at the largest factor in the grid, and one signal had reached the green and cycle caps from factor 1.4 on, so the preregistered range ends below the target; extending it would be a new protocol, decided before running, not a relaxation of this one. One provenance deviation is recorded: the workstation’s OpenStreetMap extract had been fetched with a different bounding box, so the configured area was re-fetched from the OSM API on 23 October; the rebuilt corridor is structurally identical to the audited one (82 edges, the same edge lists, entries, exits and 22 signals) but its content hash differs, and all v5 runs use the re-fetched network.</w:t>
+      </w:r>
+    </w:p>
+    <w:p>
+      <w:pPr>
+        <w:pStyle w:val="tablehead"/>
+        <w:keepNext/>
+      </w:pPr>
+      <w:r>
+        <w:t xml:space="preserve">Signal-Split Calibration, Protocol v5 (SIMULATION)</w:t>
+      </w:r>
+    </w:p>
+    <w:tbl>
+      <w:tblPr>
+        <w:tblW w:w="243.30pt" w:type="dxa"/>
+        <w:jc w:val="center"/>
+        <w:tblBorders>
+          <w:top w:val="single" w:sz="2" w:space="0" w:color="auto"/>
+          <w:start w:val="single" w:sz="2" w:space="0" w:color="auto"/>
+          <w:bottom w:val="single" w:sz="2" w:space="0" w:color="auto"/>
+          <w:end w:val="single" w:sz="2" w:space="0" w:color="auto"/>
+          <w:insideH w:val="single" w:sz="2" w:space="0" w:color="auto"/>
+          <w:insideV w:val="single" w:sz="2" w:space="0" w:color="auto"/>
+        </w:tblBorders>
+        <w:tblLayout w:type="fixed"/>
+        <w:tblCellMar>
+          <w:start w:w="2pt" w:type="dxa"/>
+          <w:end w:w="2pt" w:type="dxa"/>
+        </w:tblCellMar>
+        <w:tblLook w:firstRow="1" w:lastRow="0" w:firstColumn="0" w:lastColumn="0" w:noHBand="1" w:noVBand="1"/>
+      </w:tblPr>
+      <w:tblGrid>
+        <w:gridCol w:w="680"/>
+        <w:gridCol w:w="720"/>
+        <w:gridCol w:w="720"/>
+        <w:gridCol w:w="1200"/>
+        <w:gridCol w:w="760"/>
+        <w:gridCol w:w="786"/>
+      </w:tblGrid>
+      <w:tr>
+        <w:trPr>
+          <w:cantSplit/>
+          <w:tblHeader/>
+          <w:jc w:val="center"/>
+        </w:trPr>
+        <w:tc>
+          <w:tcPr>
+            <w:tcW w:w="34.00pt" w:type="dxa"/>
+            <w:vAlign w:val="center"/>
+          </w:tcPr>
+          <w:p>
+            <w:pPr>
+              <w:pStyle w:val="tablecolhead"/>
+              <w:keepNext/>
+              <w:jc w:val="center"/>
+            </w:pPr>
+            <w:r>
+              <w:rPr>
+                <w:b/>
+                <w:bCs/>
+                <w:sz w:val="13"/>
+                <w:szCs w:val="13"/>
+              </w:rPr>
+              <w:t xml:space="preserve">Green factor</w:t>
+            </w:r>
+          </w:p>
+        </w:tc>
+        <w:tc>
+          <w:tcPr>
+            <w:tcW w:w="36.00pt" w:type="dxa"/>
+            <w:vAlign w:val="center"/>
+          </w:tcPr>
+          <w:p>
+            <w:pPr>
+              <w:pStyle w:val="tablecolhead"/>
+              <w:keepNext/>
+              <w:jc w:val="center"/>
+            </w:pPr>
+            <w:r>
+              <w:rPr>
+                <w:b/>
+                <w:bCs/>
+                <w:sz w:val="13"/>
+                <w:szCs w:val="13"/>
+              </w:rPr>
+              <w:t xml:space="preserve">Speed (mph)</w:t>
+            </w:r>
+          </w:p>
+        </w:tc>
+        <w:tc>
+          <w:tcPr>
+            <w:tcW w:w="36.00pt" w:type="dxa"/>
+            <w:vAlign w:val="center"/>
+          </w:tcPr>
+          <w:p>
+            <w:pPr>
+              <w:pStyle w:val="tablecolhead"/>
+              <w:keepNext/>
+              <w:jc w:val="center"/>
+            </w:pPr>
+            <w:r>
+              <w:rPr>
+                <w:b/>
+                <w:bCs/>
+                <w:sz w:val="13"/>
+                <w:szCs w:val="13"/>
+              </w:rPr>
+              <w:t xml:space="preserve">Gap (mph)</w:t>
+            </w:r>
+          </w:p>
+        </w:tc>
+        <w:tc>
+          <w:tcPr>
+            <w:tcW w:w="60.00pt" w:type="dxa"/>
+            <w:vAlign w:val="center"/>
+          </w:tcPr>
+          <w:p>
+            <w:pPr>
+              <w:pStyle w:val="tablecolhead"/>
+              <w:keepNext/>
+              <w:jc w:val="center"/>
+            </w:pPr>
+            <w:r>
+              <w:rPr>
+                <w:b/>
+                <w:bCs/>
+                <w:sz w:val="13"/>
+                <w:szCs w:val="13"/>
+              </w:rPr>
+              <w:t xml:space="preserve">Unfinished per seed</w:t>
+            </w:r>
+          </w:p>
+        </w:tc>
+        <w:tc>
+          <w:tcPr>
+            <w:tcW w:w="38.00pt" w:type="dxa"/>
+            <w:vAlign w:val="center"/>
+          </w:tcPr>
+          <w:p>
+            <w:pPr>
+              <w:pStyle w:val="tablecolhead"/>
+              <w:keepNext/>
+              <w:jc w:val="center"/>
+            </w:pPr>
+            <w:r>
+              <w:rPr>
+                <w:b/>
+                <w:bCs/>
+                <w:sz w:val="13"/>
+                <w:szCs w:val="13"/>
+              </w:rPr>
+              <w:t xml:space="preserve">Max cycle (s)</w:t>
+            </w:r>
+          </w:p>
+        </w:tc>
+        <w:tc>
+          <w:tcPr>
+            <w:tcW w:w="39.30pt" w:type="dxa"/>
+            <w:vAlign w:val="center"/>
+          </w:tcPr>
+          <w:p>
+            <w:pPr>
+              <w:pStyle w:val="tablecolhead"/>
+              <w:keepNext/>
+              <w:jc w:val="center"/>
+            </w:pPr>
+            <w:r>
+              <w:rPr>
+                <w:b/>
+                <w:bCs/>
+                <w:sz w:val="13"/>
+                <w:szCs w:val="13"/>
+              </w:rPr>
+              <w:t xml:space="preserve">Admissible</w:t>
+            </w:r>
+          </w:p>
+        </w:tc>
+      </w:tr>
+      <w:tr>
+        <w:trPr>
+          <w:cantSplit/>
+          <w:jc w:val="center"/>
+        </w:trPr>
+        <w:tc>
+          <w:tcPr>
+            <w:tcW w:w="34.00pt" w:type="dxa"/>
+            <w:vAlign w:val="center"/>
+          </w:tcPr>
+          <w:p>
+            <w:pPr>
+              <w:pStyle w:val="tablecopy"/>
+              <w:keepNext/>
+              <w:jc w:val="center"/>
+            </w:pPr>
+            <w:r>
+              <w:rPr>
+                <w:sz w:val="13"/>
+                <w:szCs w:val="13"/>
+              </w:rPr>
+              <w:t xml:space="preserve">1.0</w:t>
+            </w:r>
+          </w:p>
+        </w:tc>
+        <w:tc>
+          <w:tcPr>
+            <w:tcW w:w="36.00pt" w:type="dxa"/>
+            <w:vAlign w:val="center"/>
+          </w:tcPr>
+          <w:p>
+            <w:pPr>
+              <w:pStyle w:val="tablecopy"/>
+              <w:keepNext/>
+              <w:jc w:val="end"/>
+            </w:pPr>
+            <w:r>
+              <w:rPr>
+                <w:sz w:val="13"/>
+                <w:szCs w:val="13"/>
+              </w:rPr>
+              <w:t xml:space="preserve">5.82</w:t>
+            </w:r>
+          </w:p>
+        </w:tc>
+        <w:tc>
+          <w:tcPr>
+            <w:tcW w:w="36.00pt" w:type="dxa"/>
+            <w:vAlign w:val="center"/>
+          </w:tcPr>
+          <w:p>
+            <w:pPr>
+              <w:pStyle w:val="tablecopy"/>
+              <w:keepNext/>
+              <w:jc w:val="end"/>
+            </w:pPr>
+            <w:r>
+              <w:rPr>
+                <w:sz w:val="13"/>
+                <w:szCs w:val="13"/>
+              </w:rPr>
+              <w:t xml:space="preserve">−5.13</w:t>
+            </w:r>
+          </w:p>
+        </w:tc>
+        <w:tc>
+          <w:tcPr>
+            <w:tcW w:w="60.00pt" w:type="dxa"/>
+            <w:vAlign w:val="center"/>
+          </w:tcPr>
+          <w:p>
+            <w:pPr>
+              <w:pStyle w:val="tablecopy"/>
+              <w:keepNext/>
+              <w:jc w:val="center"/>
+            </w:pPr>
+            <w:r>
+              <w:rPr>
+                <w:sz w:val="13"/>
+                <w:szCs w:val="13"/>
+              </w:rPr>
+              <w:t xml:space="preserve">568 / 531 / 523</w:t>
+            </w:r>
+          </w:p>
+        </w:tc>
+        <w:tc>
+          <w:tcPr>
+            <w:tcW w:w="38.00pt" w:type="dxa"/>
+            <w:vAlign w:val="center"/>
+          </w:tcPr>
+          <w:p>
+            <w:pPr>
+              <w:pStyle w:val="tablecopy"/>
+              <w:keepNext/>
+              <w:jc w:val="end"/>
+            </w:pPr>
+            <w:r>
+              <w:rPr>
+                <w:sz w:val="13"/>
+                <w:szCs w:val="13"/>
+              </w:rPr>
+              <w:t xml:space="preserve">102</w:t>
+            </w:r>
+          </w:p>
+        </w:tc>
+        <w:tc>
+          <w:tcPr>
+            <w:tcW w:w="39.30pt" w:type="dxa"/>
+            <w:vAlign w:val="center"/>
+          </w:tcPr>
+          <w:p>
+            <w:pPr>
+              <w:pStyle w:val="tablecopy"/>
+              <w:keepNext/>
+              <w:jc w:val="center"/>
+            </w:pPr>
+            <w:r>
+              <w:rPr>
+                <w:sz w:val="13"/>
+                <w:szCs w:val="13"/>
+              </w:rPr>
+              <w:t xml:space="preserve">no</w:t>
+            </w:r>
+          </w:p>
+        </w:tc>
+      </w:tr>
+      <w:tr>
+        <w:trPr>
+          <w:cantSplit/>
+          <w:jc w:val="center"/>
+        </w:trPr>
+        <w:tc>
+          <w:tcPr>
+            <w:tcW w:w="34.00pt" w:type="dxa"/>
+            <w:vAlign w:val="center"/>
+          </w:tcPr>
+          <w:p>
+            <w:pPr>
+              <w:pStyle w:val="tablecopy"/>
+              <w:keepNext/>
+              <w:jc w:val="center"/>
+            </w:pPr>
+            <w:r>
+              <w:rPr>
+                <w:sz w:val="13"/>
+                <w:szCs w:val="13"/>
+              </w:rPr>
+              <w:t xml:space="preserve">1.2</w:t>
+            </w:r>
+          </w:p>
+        </w:tc>
+        <w:tc>
+          <w:tcPr>
+            <w:tcW w:w="36.00pt" w:type="dxa"/>
+            <w:vAlign w:val="center"/>
+          </w:tcPr>
+          <w:p>
+            <w:pPr>
+              <w:pStyle w:val="tablecopy"/>
+              <w:keepNext/>
+              <w:jc w:val="end"/>
+            </w:pPr>
+            <w:r>
+              <w:rPr>
+                <w:sz w:val="13"/>
+                <w:szCs w:val="13"/>
+              </w:rPr>
+              <w:t xml:space="preserve">6.16</w:t>
+            </w:r>
+          </w:p>
+        </w:tc>
+        <w:tc>
+          <w:tcPr>
+            <w:tcW w:w="36.00pt" w:type="dxa"/>
+            <w:vAlign w:val="center"/>
+          </w:tcPr>
+          <w:p>
+            <w:pPr>
+              <w:pStyle w:val="tablecopy"/>
+              <w:keepNext/>
+              <w:jc w:val="end"/>
+            </w:pPr>
+            <w:r>
+              <w:rPr>
+                <w:sz w:val="13"/>
+                <w:szCs w:val="13"/>
+              </w:rPr>
+              <w:t xml:space="preserve">−4.79</w:t>
+            </w:r>
+          </w:p>
+        </w:tc>
+        <w:tc>
+          <w:tcPr>
+            <w:tcW w:w="60.00pt" w:type="dxa"/>
+            <w:vAlign w:val="center"/>
+          </w:tcPr>
+          <w:p>
+            <w:pPr>
+              <w:pStyle w:val="tablecopy"/>
+              <w:keepNext/>
+              <w:jc w:val="center"/>
+            </w:pPr>
+            <w:r>
+              <w:rPr>
+                <w:sz w:val="13"/>
+                <w:szCs w:val="13"/>
+              </w:rPr>
+              <w:t xml:space="preserve">383 / 382 / 406</w:t>
+            </w:r>
+          </w:p>
+        </w:tc>
+        <w:tc>
+          <w:tcPr>
+            <w:tcW w:w="38.00pt" w:type="dxa"/>
+            <w:vAlign w:val="center"/>
+          </w:tcPr>
+          <w:p>
+            <w:pPr>
+              <w:pStyle w:val="tablecopy"/>
+              <w:keepNext/>
+              <w:jc w:val="end"/>
+            </w:pPr>
+            <w:r>
+              <w:rPr>
+                <w:sz w:val="13"/>
+                <w:szCs w:val="13"/>
+              </w:rPr>
+              <w:t xml:space="preserve">117</w:t>
+            </w:r>
+          </w:p>
+        </w:tc>
+        <w:tc>
+          <w:tcPr>
+            <w:tcW w:w="39.30pt" w:type="dxa"/>
+            <w:vAlign w:val="center"/>
+          </w:tcPr>
+          <w:p>
+            <w:pPr>
+              <w:pStyle w:val="tablecopy"/>
+              <w:keepNext/>
+              <w:jc w:val="center"/>
+            </w:pPr>
+            <w:r>
+              <w:rPr>
+                <w:sz w:val="13"/>
+                <w:szCs w:val="13"/>
+              </w:rPr>
+              <w:t xml:space="preserve">no</w:t>
+            </w:r>
+          </w:p>
+        </w:tc>
+      </w:tr>
+      <w:tr>
+        <w:trPr>
+          <w:cantSplit/>
+          <w:jc w:val="center"/>
+        </w:trPr>
+        <w:tc>
+          <w:tcPr>
+            <w:tcW w:w="34.00pt" w:type="dxa"/>
+            <w:vAlign w:val="center"/>
+          </w:tcPr>
+          <w:p>
+            <w:pPr>
+              <w:pStyle w:val="tablecopy"/>
+              <w:keepNext/>
+              <w:jc w:val="center"/>
+            </w:pPr>
+            <w:r>
+              <w:rPr>
+                <w:sz w:val="13"/>
+                <w:szCs w:val="13"/>
+              </w:rPr>
+              <w:t xml:space="preserve">1.4</w:t>
+            </w:r>
+          </w:p>
+        </w:tc>
+        <w:tc>
+          <w:tcPr>
+            <w:tcW w:w="36.00pt" w:type="dxa"/>
+            <w:vAlign w:val="center"/>
+          </w:tcPr>
+          <w:p>
+            <w:pPr>
+              <w:pStyle w:val="tablecopy"/>
+              <w:keepNext/>
+              <w:jc w:val="end"/>
+            </w:pPr>
+            <w:r>
+              <w:rPr>
+                <w:sz w:val="13"/>
+                <w:szCs w:val="13"/>
+              </w:rPr>
+              <w:t xml:space="preserve">6.52</w:t>
+            </w:r>
+          </w:p>
+        </w:tc>
+        <w:tc>
+          <w:tcPr>
+            <w:tcW w:w="36.00pt" w:type="dxa"/>
+            <w:vAlign w:val="center"/>
+          </w:tcPr>
+          <w:p>
+            <w:pPr>
+              <w:pStyle w:val="tablecopy"/>
+              <w:keepNext/>
+              <w:jc w:val="end"/>
+            </w:pPr>
+            <w:r>
+              <w:rPr>
+                <w:sz w:val="13"/>
+                <w:szCs w:val="13"/>
+              </w:rPr>
+              <w:t xml:space="preserve">−4.43</w:t>
+            </w:r>
+          </w:p>
+        </w:tc>
+        <w:tc>
+          <w:tcPr>
+            <w:tcW w:w="60.00pt" w:type="dxa"/>
+            <w:vAlign w:val="center"/>
+          </w:tcPr>
+          <w:p>
+            <w:pPr>
+              <w:pStyle w:val="tablecopy"/>
+              <w:keepNext/>
+              <w:jc w:val="center"/>
+            </w:pPr>
+            <w:r>
+              <w:rPr>
+                <w:sz w:val="13"/>
+                <w:szCs w:val="13"/>
+              </w:rPr>
+              <w:t xml:space="preserve">276 / 274 / 302</w:t>
+            </w:r>
+          </w:p>
+        </w:tc>
+        <w:tc>
+          <w:tcPr>
+            <w:tcW w:w="38.00pt" w:type="dxa"/>
+            <w:vAlign w:val="center"/>
+          </w:tcPr>
+          <w:p>
+            <w:pPr>
+              <w:pStyle w:val="tablecopy"/>
+              <w:keepNext/>
+              <w:jc w:val="end"/>
+            </w:pPr>
+            <w:r>
+              <w:rPr>
+                <w:sz w:val="13"/>
+                <w:szCs w:val="13"/>
+              </w:rPr>
+              <w:t xml:space="preserve">119</w:t>
+            </w:r>
+          </w:p>
+        </w:tc>
+        <w:tc>
+          <w:tcPr>
+            <w:tcW w:w="39.30pt" w:type="dxa"/>
+            <w:vAlign w:val="center"/>
+          </w:tcPr>
+          <w:p>
+            <w:pPr>
+              <w:pStyle w:val="tablecopy"/>
+              <w:keepNext/>
+              <w:jc w:val="center"/>
+            </w:pPr>
+            <w:r>
+              <w:rPr>
+                <w:sz w:val="13"/>
+                <w:szCs w:val="13"/>
+              </w:rPr>
+              <w:t xml:space="preserve">no</w:t>
+            </w:r>
+          </w:p>
+        </w:tc>
+      </w:tr>
+      <w:tr>
+        <w:trPr>
+          <w:cantSplit/>
+          <w:jc w:val="center"/>
+        </w:trPr>
+        <w:tc>
+          <w:tcPr>
+            <w:tcW w:w="34.00pt" w:type="dxa"/>
+            <w:vAlign w:val="center"/>
+          </w:tcPr>
+          <w:p>
+            <w:pPr>
+              <w:pStyle w:val="tablecopy"/>
+              <w:keepNext/>
+              <w:jc w:val="center"/>
+            </w:pPr>
+            <w:r>
+              <w:rPr>
+                <w:sz w:val="13"/>
+                <w:szCs w:val="13"/>
+              </w:rPr>
+              <w:t xml:space="preserve">1.6</w:t>
+            </w:r>
+          </w:p>
+        </w:tc>
+        <w:tc>
+          <w:tcPr>
+            <w:tcW w:w="36.00pt" w:type="dxa"/>
+            <w:vAlign w:val="center"/>
+          </w:tcPr>
+          <w:p>
+            <w:pPr>
+              <w:pStyle w:val="tablecopy"/>
+              <w:keepNext/>
+              <w:jc w:val="end"/>
+            </w:pPr>
+            <w:r>
+              <w:rPr>
+                <w:sz w:val="13"/>
+                <w:szCs w:val="13"/>
+              </w:rPr>
+              <w:t xml:space="preserve">6.85</w:t>
+            </w:r>
+          </w:p>
+        </w:tc>
+        <w:tc>
+          <w:tcPr>
+            <w:tcW w:w="36.00pt" w:type="dxa"/>
+            <w:vAlign w:val="center"/>
+          </w:tcPr>
+          <w:p>
+            <w:pPr>
+              <w:pStyle w:val="tablecopy"/>
+              <w:keepNext/>
+              <w:jc w:val="end"/>
+            </w:pPr>
+            <w:r>
+              <w:rPr>
+                <w:sz w:val="13"/>
+                <w:szCs w:val="13"/>
+              </w:rPr>
+              <w:t xml:space="preserve">−4.10</w:t>
+            </w:r>
+          </w:p>
+        </w:tc>
+        <w:tc>
+          <w:tcPr>
+            <w:tcW w:w="60.00pt" w:type="dxa"/>
+            <w:vAlign w:val="center"/>
+          </w:tcPr>
+          <w:p>
+            <w:pPr>
+              <w:pStyle w:val="tablecopy"/>
+              <w:keepNext/>
+              <w:jc w:val="center"/>
+            </w:pPr>
+            <w:r>
+              <w:rPr>
+                <w:sz w:val="13"/>
+                <w:szCs w:val="13"/>
+              </w:rPr>
+              <w:t xml:space="preserve">194 / 206 / 165</w:t>
+            </w:r>
+          </w:p>
+        </w:tc>
+        <w:tc>
+          <w:tcPr>
+            <w:tcW w:w="38.00pt" w:type="dxa"/>
+            <w:vAlign w:val="center"/>
+          </w:tcPr>
+          <w:p>
+            <w:pPr>
+              <w:pStyle w:val="tablecopy"/>
+              <w:keepNext/>
+              <w:jc w:val="end"/>
+            </w:pPr>
+            <w:r>
+              <w:rPr>
+                <w:sz w:val="13"/>
+                <w:szCs w:val="13"/>
+              </w:rPr>
+              <w:t xml:space="preserve">119</w:t>
+            </w:r>
+          </w:p>
+        </w:tc>
+        <w:tc>
+          <w:tcPr>
+            <w:tcW w:w="39.30pt" w:type="dxa"/>
+            <w:vAlign w:val="center"/>
+          </w:tcPr>
+          <w:p>
+            <w:pPr>
+              <w:pStyle w:val="tablecopy"/>
+              <w:keepNext/>
+              <w:jc w:val="center"/>
+            </w:pPr>
+            <w:r>
+              <w:rPr>
+                <w:sz w:val="13"/>
+                <w:szCs w:val="13"/>
+              </w:rPr>
+              <w:t xml:space="preserve">no</w:t>
+            </w:r>
+          </w:p>
+        </w:tc>
+      </w:tr>
+      <w:tr>
+        <w:trPr>
+          <w:cantSplit/>
+          <w:jc w:val="center"/>
+        </w:trPr>
+        <w:tc>
+          <w:tcPr>
+            <w:tcW w:w="34.00pt" w:type="dxa"/>
+            <w:vAlign w:val="center"/>
+          </w:tcPr>
+          <w:p>
+            <w:pPr>
+              <w:pStyle w:val="tablecopy"/>
+              <w:keepNext/>
+              <w:jc w:val="center"/>
+            </w:pPr>
+            <w:r>
+              <w:rPr>
+                <w:sz w:val="13"/>
+                <w:szCs w:val="13"/>
+              </w:rPr>
+              <w:t xml:space="preserve">1.8</w:t>
+            </w:r>
+          </w:p>
+        </w:tc>
+        <w:tc>
+          <w:tcPr>
+            <w:tcW w:w="36.00pt" w:type="dxa"/>
+            <w:vAlign w:val="center"/>
+          </w:tcPr>
+          <w:p>
+            <w:pPr>
+              <w:pStyle w:val="tablecopy"/>
+              <w:keepNext/>
+              <w:jc w:val="end"/>
+            </w:pPr>
+            <w:r>
+              <w:rPr>
+                <w:sz w:val="13"/>
+                <w:szCs w:val="13"/>
+              </w:rPr>
+              <w:t xml:space="preserve">7.13</w:t>
+            </w:r>
+          </w:p>
+        </w:tc>
+        <w:tc>
+          <w:tcPr>
+            <w:tcW w:w="36.00pt" w:type="dxa"/>
+            <w:vAlign w:val="center"/>
+          </w:tcPr>
+          <w:p>
+            <w:pPr>
+              <w:pStyle w:val="tablecopy"/>
+              <w:keepNext/>
+              <w:jc w:val="end"/>
+            </w:pPr>
+            <w:r>
+              <w:rPr>
+                <w:sz w:val="13"/>
+                <w:szCs w:val="13"/>
+              </w:rPr>
+              <w:t xml:space="preserve">−3.82</w:t>
+            </w:r>
+          </w:p>
+        </w:tc>
+        <w:tc>
+          <w:tcPr>
+            <w:tcW w:w="60.00pt" w:type="dxa"/>
+            <w:vAlign w:val="center"/>
+          </w:tcPr>
+          <w:p>
+            <w:pPr>
+              <w:pStyle w:val="tablecopy"/>
+              <w:keepNext/>
+              <w:jc w:val="center"/>
+            </w:pPr>
+            <w:r>
+              <w:rPr>
+                <w:sz w:val="13"/>
+                <w:szCs w:val="13"/>
+              </w:rPr>
+              <w:t xml:space="preserve">98 / 110 / 124</w:t>
+            </w:r>
+          </w:p>
+        </w:tc>
+        <w:tc>
+          <w:tcPr>
+            <w:tcW w:w="38.00pt" w:type="dxa"/>
+            <w:vAlign w:val="center"/>
+          </w:tcPr>
+          <w:p>
+            <w:pPr>
+              <w:pStyle w:val="tablecopy"/>
+              <w:keepNext/>
+              <w:jc w:val="end"/>
+            </w:pPr>
+            <w:r>
+              <w:rPr>
+                <w:sz w:val="13"/>
+                <w:szCs w:val="13"/>
+              </w:rPr>
+              <w:t xml:space="preserve">119</w:t>
+            </w:r>
+          </w:p>
+        </w:tc>
+        <w:tc>
+          <w:tcPr>
+            <w:tcW w:w="39.30pt" w:type="dxa"/>
+            <w:vAlign w:val="center"/>
+          </w:tcPr>
+          <w:p>
+            <w:pPr>
+              <w:pStyle w:val="tablecopy"/>
+              <w:keepNext/>
+              <w:jc w:val="center"/>
+            </w:pPr>
+            <w:r>
+              <w:rPr>
+                <w:sz w:val="13"/>
+                <w:szCs w:val="13"/>
+              </w:rPr>
+              <w:t xml:space="preserve">no</w:t>
+            </w:r>
+          </w:p>
+        </w:tc>
+      </w:tr>
+      <w:tr>
+        <w:trPr>
+          <w:cantSplit/>
+          <w:jc w:val="center"/>
+        </w:trPr>
+        <w:tc>
+          <w:tcPr>
+            <w:tcW w:w="34.00pt" w:type="dxa"/>
+            <w:vAlign w:val="center"/>
+          </w:tcPr>
+          <w:p>
+            <w:pPr>
+              <w:pStyle w:val="tablecopy"/>
+              <w:keepNext/>
+              <w:jc w:val="center"/>
+            </w:pPr>
+            <w:r>
+              <w:rPr>
+                <w:sz w:val="13"/>
+                <w:szCs w:val="13"/>
+              </w:rPr>
+              <w:t xml:space="preserve">2.0</w:t>
+            </w:r>
+          </w:p>
+        </w:tc>
+        <w:tc>
+          <w:tcPr>
+            <w:tcW w:w="36.00pt" w:type="dxa"/>
+            <w:vAlign w:val="center"/>
+          </w:tcPr>
+          <w:p>
+            <w:pPr>
+              <w:pStyle w:val="tablecopy"/>
+              <w:keepNext/>
+              <w:jc w:val="end"/>
+            </w:pPr>
+            <w:r>
+              <w:rPr>
+                <w:sz w:val="13"/>
+                <w:szCs w:val="13"/>
+              </w:rPr>
+              <w:t xml:space="preserve">7.49</w:t>
+            </w:r>
+          </w:p>
+        </w:tc>
+        <w:tc>
+          <w:tcPr>
+            <w:tcW w:w="36.00pt" w:type="dxa"/>
+            <w:vAlign w:val="center"/>
+          </w:tcPr>
+          <w:p>
+            <w:pPr>
+              <w:pStyle w:val="tablecopy"/>
+              <w:keepNext/>
+              <w:jc w:val="end"/>
+            </w:pPr>
+            <w:r>
+              <w:rPr>
+                <w:sz w:val="13"/>
+                <w:szCs w:val="13"/>
+              </w:rPr>
+              <w:t xml:space="preserve">−3.46</w:t>
+            </w:r>
+          </w:p>
+        </w:tc>
+        <w:tc>
+          <w:tcPr>
+            <w:tcW w:w="60.00pt" w:type="dxa"/>
+            <w:vAlign w:val="center"/>
+          </w:tcPr>
+          <w:p>
+            <w:pPr>
+              <w:pStyle w:val="tablecopy"/>
+              <w:keepNext/>
+              <w:jc w:val="center"/>
+            </w:pPr>
+            <w:r>
+              <w:rPr>
+                <w:sz w:val="13"/>
+                <w:szCs w:val="13"/>
+              </w:rPr>
+              <w:t xml:space="preserve">1 / 0 / 28</w:t>
+            </w:r>
+          </w:p>
+        </w:tc>
+        <w:tc>
+          <w:tcPr>
+            <w:tcW w:w="38.00pt" w:type="dxa"/>
+            <w:vAlign w:val="center"/>
+          </w:tcPr>
+          <w:p>
+            <w:pPr>
+              <w:pStyle w:val="tablecopy"/>
+              <w:keepNext/>
+              <w:jc w:val="end"/>
+            </w:pPr>
+            <w:r>
+              <w:rPr>
+                <w:sz w:val="13"/>
+                <w:szCs w:val="13"/>
+              </w:rPr>
+              <w:t xml:space="preserve">119</w:t>
+            </w:r>
+          </w:p>
+        </w:tc>
+        <w:tc>
+          <w:tcPr>
+            <w:tcW w:w="39.30pt" w:type="dxa"/>
+            <w:vAlign w:val="center"/>
+          </w:tcPr>
+          <w:p>
+            <w:pPr>
+              <w:pStyle w:val="tablecopy"/>
+              <w:keepNext/>
+              <w:jc w:val="center"/>
+            </w:pPr>
+            <w:r>
+              <w:rPr>
+                <w:sz w:val="13"/>
+                <w:szCs w:val="13"/>
+              </w:rPr>
+              <w:t xml:space="preserve">yes</w:t>
+            </w:r>
+          </w:p>
+        </w:tc>
+      </w:tr>
+      <w:tr>
+        <w:trPr>
+          <w:cantSplit/>
+          <w:jc w:val="center"/>
+        </w:trPr>
+        <w:tc>
+          <w:tcPr>
+            <w:tcW w:w="34.00pt" w:type="dxa"/>
+            <w:vAlign w:val="center"/>
+          </w:tcPr>
+          <w:p>
+            <w:pPr>
+              <w:pStyle w:val="tablecopy"/>
+              <w:jc w:val="center"/>
+            </w:pPr>
+            <w:r>
+              <w:rPr>
+                <w:sz w:val="13"/>
+                <w:szCs w:val="13"/>
+              </w:rPr>
+              <w:t xml:space="preserve">2.5</w:t>
+            </w:r>
+          </w:p>
+        </w:tc>
+        <w:tc>
+          <w:tcPr>
+            <w:tcW w:w="36.00pt" w:type="dxa"/>
+            <w:vAlign w:val="center"/>
+          </w:tcPr>
+          <w:p>
+            <w:pPr>
+              <w:pStyle w:val="tablecopy"/>
+              <w:jc w:val="end"/>
+            </w:pPr>
+            <w:r>
+              <w:rPr>
+                <w:sz w:val="13"/>
+                <w:szCs w:val="13"/>
+              </w:rPr>
+              <w:t xml:space="preserve">8.10</w:t>
+            </w:r>
+          </w:p>
+        </w:tc>
+        <w:tc>
+          <w:tcPr>
+            <w:tcW w:w="36.00pt" w:type="dxa"/>
+            <w:vAlign w:val="center"/>
+          </w:tcPr>
+          <w:p>
+            <w:pPr>
+              <w:pStyle w:val="tablecopy"/>
+              <w:jc w:val="end"/>
+            </w:pPr>
+            <w:r>
+              <w:rPr>
+                <w:sz w:val="13"/>
+                <w:szCs w:val="13"/>
+              </w:rPr>
+              <w:t xml:space="preserve">−2.85</w:t>
+            </w:r>
+          </w:p>
+        </w:tc>
+        <w:tc>
+          <w:tcPr>
+            <w:tcW w:w="60.00pt" w:type="dxa"/>
+            <w:vAlign w:val="center"/>
+          </w:tcPr>
+          <w:p>
+            <w:pPr>
+              <w:pStyle w:val="tablecopy"/>
+              <w:jc w:val="center"/>
+            </w:pPr>
+            <w:r>
+              <w:rPr>
+                <w:sz w:val="13"/>
+                <w:szCs w:val="13"/>
+              </w:rPr>
+              <w:t xml:space="preserve">0 / 0 / 0</w:t>
+            </w:r>
+          </w:p>
+        </w:tc>
+        <w:tc>
+          <w:tcPr>
+            <w:tcW w:w="38.00pt" w:type="dxa"/>
+            <w:vAlign w:val="center"/>
+          </w:tcPr>
+          <w:p>
+            <w:pPr>
+              <w:pStyle w:val="tablecopy"/>
+              <w:jc w:val="end"/>
+            </w:pPr>
+            <w:r>
+              <w:rPr>
+                <w:sz w:val="13"/>
+                <w:szCs w:val="13"/>
+              </w:rPr>
+              <w:t xml:space="preserve">119</w:t>
+            </w:r>
+          </w:p>
+        </w:tc>
+        <w:tc>
+          <w:tcPr>
+            <w:tcW w:w="39.30pt" w:type="dxa"/>
+            <w:vAlign w:val="center"/>
+          </w:tcPr>
+          <w:p>
+            <w:pPr>
+              <w:pStyle w:val="tablecopy"/>
+              <w:jc w:val="center"/>
+            </w:pPr>
+            <w:r>
+              <w:rPr>
+                <w:sz w:val="13"/>
+                <w:szCs w:val="13"/>
+              </w:rPr>
+              <w:t xml:space="preserve">yes</w:t>
+            </w:r>
+          </w:p>
+        </w:tc>
+      </w:tr>
+    </w:tbl>
+    <w:p>
+      <w:pPr>
+        <w:pStyle w:val="tablecopy"/>
+        <w:spacing w:before="3pt" w:after="8pt"/>
+      </w:pPr>
+      <w:r>
+        <w:rPr>
+          <w:i/>
+          <w:iCs/>
+          <w:sz w:val="14"/>
+          <w:szCs w:val="14"/>
+        </w:rPr>
+        <w:t xml:space="preserve">Note:</w:t>
+      </w:r>
+      <w:r>
+        <w:rPr>
+          <w:sz w:val="14"/>
+          <w:szCs w:val="14"/>
+        </w:rPr>
+        <w:t xml:space="preserve"> Corridor green share of the Webster plan scaled by a factor from a grid fixed before the run (cycle at most 120 s, phase states unchanged), fixed-time baseline, seeds 101, 102 and 103, no side-street demand, 2025 counts, 5,368 vehicles loaded per run. Speed is the seed-mean space-mean speed on the SUMO edges mapped to DOT link 4456494; gap is to the observed weekday PM-peak 10.95 mph, tolerance ±1.5 mph. A factor is admissible with no teleport and at most 1% unfinished trips in every seed. No factor is selected: the closest admissible one (2.5) is 2.85 mph short of the target.</w:t>
       </w:r>
     </w:p>
     <w:p>

</xml_diff>

<commit_message>
Word paper: limitations and future work mirror the v5 calibration outcome
Co-Authored-By: Claude Opus 5.5 (1M context) <noreply@anthropic.com>
Claude-Session: https://claude.ai/code/session_01UKAyPjXQRWjVWPVDNV1WWD
</commit_message>
<xml_diff>
--- a/paper/ieee_conference_paper.docx
+++ b/paper/ieee_conference_paper.docx
@@ -14316,7 +14316,7 @@
         <w:t xml:space="preserve">Simulation:</w:t>
       </w:r>
       <w:r>
-        <w:t xml:space="preserve"> The SUMO testbed is a scenario built from OSM geometry with declared demand and default signal programs, not a calibrated digital twin, and contains no pedestrian demand; only one of the two mapped DOT links is a forecastable one and the scenarios’ demand and congestion flags are declared rather than derived from its observations, so the testbed is a transfer demonstration. The first 45-run comparison used SUMO’s insertion routing and a stub entry edge and is superseded. Its corrected protocols use the only weekday automated count on the corridor (2014, one direction) and then two-direction classification counts from two weekdays in April 2025; side-street demand has no count. Signal programs are generated by netconvert or re-timed by Webster’s method, not NYC timing plans, and are uncoordinated although West Street is timed for 25 mph progression; lane restrictions from OpenStreetMap are dropped, which can overstate capacity. Under every protocol the testbed fails its baseline test, and with the 2025 counts it runs at 5.8 mph where the mapped link is observed at 10.95 mph, so the controller comparison is not run. No simulated gain is claimed.</w:t>
+        <w:t xml:space="preserve"> The SUMO testbed is a scenario built from OSM geometry with declared demand and default signal programs, not a calibrated digital twin, and contains no pedestrian demand; only one of the two mapped DOT links is a forecastable one and the scenarios’ demand and congestion flags are declared rather than derived from its observations, so the testbed is a transfer demonstration. The first 45-run comparison used SUMO’s insertion routing and a stub entry edge and is superseded. Its corrected protocols use the only weekday automated count on the corridor (2014, one direction) and then two-direction classification counts from two weekdays in April 2025; side-street demand has no count. Signal programs are generated by netconvert or re-timed by Webster’s method, not NYC timing plans, and are uncoordinated although West Street is timed for 25 mph progression; lane restrictions from OpenStreetMap are dropped, which can overstate capacity. Under every protocol the testbed fails its baseline test, and with the 2025 counts it runs at 5.8 mph where the mapped link is observed at 10.95 mph. The preregistered split calibration (protocol v5) raised the simulated speed to at most 8.1 mph within its green-factor grid, 2.85 mph short of the target, so no program was selected and the controller comparison is not run; the rule was not relaxed. No simulated gain is claimed.</w:t>
       </w:r>
     </w:p>
     <w:p>
@@ -14366,7 +14366,7 @@
         <w:pStyle w:val="BodyText"/>
       </w:pPr>
       <w:r>
-        <w:t xml:space="preserve">Future work, in the order the evidence suggests, is training with more seeds and without the compute budget, congestion-conditional calibration, a denser sensor network on which the spatial layer can matter, calibrating the simulation testbed’s signal splits and progression to the observed 10.95 mph PM-peak speed (or obtaining NYC DOT timing plans), pedestrian modelling, and an externally reviewed retrieval benchmark.</w:t>
+        <w:t xml:space="preserve">Future work, in the order the evidence suggests, is training with more seeds and without the compute budget, congestion-conditional calibration, a denser sensor network on which the spatial layer can matter, a second preregistered testbed calibration that adds 25 mph progression offsets to the split grid, since widening splits alone reached 8.1 of the observed 10.95 mph (or obtaining NYC DOT timing plans), pedestrian modelling, and an externally reviewed retrieval benchmark.</w:t>
       </w:r>
     </w:p>
     <w:p>

</xml_diff>

<commit_message>
Word paper: protocol v6 (prepared, NOT RUN) paragraph, table and future work
Co-Authored-By: Claude Opus 5.5 (1M context) <noreply@anthropic.com>
Claude-Session: https://claude.ai/code/session_01UKAyPjXQRWjVWPVDNV1WWD
(cherry picked from commit 09897d31f3ffe29e40bb51f07c6690b243eded15)
</commit_message>
<xml_diff>
--- a/paper/ieee_conference_paper.docx
+++ b/paper/ieee_conference_paper.docx
@@ -14097,6 +14097,113 @@
     </w:p>
     <w:p>
       <w:pPr>
+        <w:pStyle w:val="BodyText"/>
+      </w:pPr>
+      <w:r>
+        <w:rPr>
+          <w:i/>
+          <w:iCs/>
+        </w:rPr>
+        <w:t xml:space="preserve">Protocol v6 (prepared, NOT RUN).</w:t>
+      </w:r>
+      <w:r>
+        <w:t xml:space="preserve"> The authors chose a second preregistered calibration over closing the comparison or waiting for NYC DOT timing plans. Protocol v6, fixed in the configuration on 25 October 2026 before any run, keeps the v5 construction and adds what an arterial timed for progression has and the Webster plan lacks: a common cycle at every corridor signal (90 or 120 s, or the per-signal Webster cycles, which range from 21 to 102 s and so admit no progression), green factors 1.0 to 3.0, and corridor-green offsets for a 25 mph platoon along the southbound chain, the mapped link’s direction; 25 cells, three development seeds, fixed-time baseline, the same admissibility rule and the same 10.95 ± 1.5 mph target, ties going to the least intervention (</w:t>
+      </w:r>
+      <w:r>
+        <w:t xml:space="preserve">Table XI</w:t>
+      </w:r>
+      <w:r>
+        <w:t xml:space="preserve">). At the time of writing it has not been run; any selected program will be reported as a calibrated scenario testbed, not as NYC DOT timing.</w:t>
+      </w:r>
+    </w:p>
+    <w:p>
+      <w:pPr>
+        <w:pStyle w:val="tablehead"/>
+        <w:keepNext/>
+      </w:pPr>
+      <w:r>
+        <w:t xml:space="preserve">Signal-Timing Calibration, Protocol v6 (SIMULATION)</w:t>
+      </w:r>
+    </w:p>
+    <w:tbl>
+      <w:tblPr>
+        <w:tblW w:w="180.00pt" w:type="dxa"/>
+        <w:jc w:val="center"/>
+        <w:tblBorders>
+          <w:top w:val="single" w:sz="2" w:space="0" w:color="auto"/>
+          <w:start w:val="single" w:sz="2" w:space="0" w:color="auto"/>
+          <w:bottom w:val="single" w:sz="2" w:space="0" w:color="auto"/>
+          <w:end w:val="single" w:sz="2" w:space="0" w:color="auto"/>
+          <w:insideH w:val="single" w:sz="2" w:space="0" w:color="auto"/>
+          <w:insideV w:val="single" w:sz="2" w:space="0" w:color="auto"/>
+        </w:tblBorders>
+        <w:tblLayout w:type="fixed"/>
+        <w:tblCellMar>
+          <w:start w:w="2pt" w:type="dxa"/>
+          <w:end w:w="2pt" w:type="dxa"/>
+        </w:tblCellMar>
+        <w:tblLook w:firstRow="1" w:lastRow="0" w:firstColumn="0" w:lastColumn="0" w:noHBand="1" w:noVBand="1"/>
+      </w:tblPr>
+      <w:tblGrid>
+        <w:gridCol w:w="3600"/>
+      </w:tblGrid>
+      <w:tr>
+        <w:trPr>
+          <w:cantSplit/>
+          <w:tblHeader/>
+          <w:jc w:val="center"/>
+        </w:trPr>
+        <w:tc>
+          <w:tcPr>
+            <w:tcW w:w="180.00pt" w:type="dxa"/>
+            <w:vAlign w:val="center"/>
+          </w:tcPr>
+          <w:p>
+            <w:pPr>
+              <w:pStyle w:val="tablecolhead"/>
+              <w:keepNext/>
+              <w:jc w:val="center"/>
+            </w:pPr>
+            <w:r>
+              <w:rPr>
+                <w:b/>
+                <w:bCs/>
+                <w:sz w:val="16"/>
+                <w:szCs w:val="16"/>
+              </w:rPr>
+              <w:t xml:space="preserve">Status</w:t>
+            </w:r>
+          </w:p>
+        </w:tc>
+      </w:tr>
+      <w:tr>
+        <w:trPr>
+          <w:cantSplit/>
+          <w:jc w:val="center"/>
+        </w:trPr>
+        <w:tc>
+          <w:tcPr>
+            <w:tcW w:w="180.00pt" w:type="dxa"/>
+            <w:vAlign w:val="center"/>
+          </w:tcPr>
+          <w:p>
+            <w:pPr>
+              <w:pStyle w:val="tablecopy"/>
+              <w:jc w:val="center"/>
+            </w:pPr>
+            <w:r>
+              <w:rPr>
+                <w:sz w:val="16"/>
+                <w:szCs w:val="16"/>
+              </w:rPr>
+              <w:t xml:space="preserve">NOT RUN</w:t>
+            </w:r>
+          </w:p>
+        </w:tc>
+      </w:tr>
+    </w:tbl>
+    <w:p>
+      <w:pPr>
         <w:pStyle w:val="Heading2"/>
       </w:pPr>
       <w:r>
@@ -14366,7 +14473,7 @@
         <w:pStyle w:val="BodyText"/>
       </w:pPr>
       <w:r>
-        <w:t xml:space="preserve">Future work, in the order the evidence suggests, is training with more seeds and without the compute budget, congestion-conditional calibration, a denser sensor network on which the spatial layer can matter, a second preregistered testbed calibration that adds 25 mph progression offsets to the split grid, since widening splits alone reached 8.1 of the observed 10.95 mph (or obtaining NYC DOT timing plans), pedestrian modelling, and an externally reviewed retrieval benchmark.</w:t>
+        <w:t xml:space="preserve">Future work, in the order the evidence suggests, is training with more seeds and without the compute budget, congestion-conditional calibration, a denser sensor network on which the spatial layer can matter, running the second preregistered testbed calibration (protocol v6: common cycle, wider green grid and 25 mph progression offsets, prepared but not run), since widening splits alone reached 8.1 of the observed 10.95 mph (or obtaining NYC DOT timing plans), pedestrian modelling, and an externally reviewed retrieval benchmark.</w:t>
       </w:r>
     </w:p>
     <w:p>

</xml_diff>

<commit_message>
Word paper: live observational run subsection; v6 and live tables render from the generated .tex
Co-Authored-By: Claude Opus 5.5 <noreply@anthropic.com>
Claude-Session: https://claude.ai/code/session_01UKAyPjXQRWjVWPVDNV1WWD
</commit_message>
<xml_diff>
--- a/paper/ieee_conference_paper.docx
+++ b/paper/ieee_conference_paper.docx
@@ -14123,6 +14123,125 @@
       </w:pPr>
       <w:r>
         <w:t xml:space="preserve">Signal-Timing Calibration, Protocol v6 (SIMULATION)</w:t>
+      </w:r>
+    </w:p>
+    <w:tbl>
+      <w:tblPr>
+        <w:tblW w:w="180.00pt" w:type="dxa"/>
+        <w:jc w:val="center"/>
+        <w:tblBorders>
+          <w:top w:val="single" w:sz="2" w:space="0" w:color="auto"/>
+          <w:start w:val="single" w:sz="2" w:space="0" w:color="auto"/>
+          <w:bottom w:val="single" w:sz="2" w:space="0" w:color="auto"/>
+          <w:end w:val="single" w:sz="2" w:space="0" w:color="auto"/>
+          <w:insideH w:val="single" w:sz="2" w:space="0" w:color="auto"/>
+          <w:insideV w:val="single" w:sz="2" w:space="0" w:color="auto"/>
+        </w:tblBorders>
+        <w:tblLayout w:type="fixed"/>
+        <w:tblCellMar>
+          <w:start w:w="2pt" w:type="dxa"/>
+          <w:end w:w="2pt" w:type="dxa"/>
+        </w:tblCellMar>
+        <w:tblLook w:firstRow="1" w:lastRow="0" w:firstColumn="0" w:lastColumn="0" w:noHBand="1" w:noVBand="1"/>
+      </w:tblPr>
+      <w:tblGrid>
+        <w:gridCol w:w="3600"/>
+      </w:tblGrid>
+      <w:tr>
+        <w:trPr>
+          <w:cantSplit/>
+          <w:tblHeader/>
+          <w:jc w:val="center"/>
+        </w:trPr>
+        <w:tc>
+          <w:tcPr>
+            <w:tcW w:w="180.00pt" w:type="dxa"/>
+            <w:vAlign w:val="center"/>
+          </w:tcPr>
+          <w:p>
+            <w:pPr>
+              <w:pStyle w:val="tablecolhead"/>
+              <w:keepNext/>
+              <w:jc w:val="center"/>
+            </w:pPr>
+            <w:r>
+              <w:rPr>
+                <w:b/>
+                <w:bCs/>
+                <w:sz w:val="16"/>
+                <w:szCs w:val="16"/>
+              </w:rPr>
+              <w:t xml:space="preserve">Status</w:t>
+            </w:r>
+          </w:p>
+        </w:tc>
+      </w:tr>
+      <w:tr>
+        <w:trPr>
+          <w:cantSplit/>
+          <w:jc w:val="center"/>
+        </w:trPr>
+        <w:tc>
+          <w:tcPr>
+            <w:tcW w:w="180.00pt" w:type="dxa"/>
+            <w:vAlign w:val="center"/>
+          </w:tcPr>
+          <w:p>
+            <w:pPr>
+              <w:pStyle w:val="tablecopy"/>
+              <w:jc w:val="center"/>
+            </w:pPr>
+            <w:r>
+              <w:rPr>
+                <w:sz w:val="16"/>
+                <w:szCs w:val="16"/>
+              </w:rPr>
+              <w:t xml:space="preserve">NOT RUN</w:t>
+            </w:r>
+          </w:p>
+        </w:tc>
+      </w:tr>
+    </w:tbl>
+    <w:p>
+      <w:pPr>
+        <w:pStyle w:val="Heading2"/>
+      </w:pPr>
+      <w:r>
+        <w:t xml:space="preserve">Live observational run</w:t>
+      </w:r>
+    </w:p>
+    <w:p>
+      <w:pPr>
+        <w:pStyle w:val="BodyText"/>
+      </w:pPr>
+      <w:r>
+        <w:t xml:space="preserve">Every forecast number above is REPLAY: the frozen model scored on the held-out partition of the archived feed. A live mode (</w:t>
+      </w:r>
+      <w:r>
+        <w:rPr>
+          <w:rFonts w:ascii="Courier New" w:hAnsi="Courier New" w:cs="Courier New"/>
+          <w:sz w:val="18"/>
+          <w:szCs w:val="18"/>
+        </w:rPr>
+        <w:t xml:space="preserve">smartcity.cli live</w:t>
+      </w:r>
+      <w:r>
+        <w:t xml:space="preserve">) was added on 28 October 2026: it pulls the newest records of the modelled links from the public feed together with the current Open-Meteo forecast and the last two days of road-related 311 requests, stores them verbatim with their retrieval time, rebuilds the 24-step window with the training-fitted transforms, runs the frozen model once per five-minute bin, writes the forecast before its earliest target time, and scores it only after the target bin is observed; links with fewer than 12 observed bins in the window are withheld and repeated or revised feed records are counted. </w:t>
+      </w:r>
+      <w:r>
+        <w:t xml:space="preserve">Table XII</w:t>
+      </w:r>
+      <w:r>
+        <w:t xml:space="preserve"> reports the outcome of the collection window. At the time of writing it has NOT been run; whatever it yields is a short window on one day, a check that the pipeline works on data that did not exist at training time, not a second test set.</w:t>
+      </w:r>
+    </w:p>
+    <w:p>
+      <w:pPr>
+        <w:pStyle w:val="tablehead"/>
+        <w:keepNext/>
+      </w:pPr>
+      <w:r>
+        <w:t xml:space="preserve">Live Observational Run (LIVE)</w:t>
       </w:r>
     </w:p>
     <w:tbl>

</xml_diff>

<commit_message>
Word paper: live-run paragraph adds the preregistered latest-available origin (NOT RUN)
Co-Authored-By: Claude Opus 5.5 <noreply@anthropic.com>
Claude-Session: https://claude.ai/code/session_01UKAyPjXQRWjVWPVDNV1WWD
</commit_message>
<xml_diff>
--- a/paper/ieee_conference_paper.docx
+++ b/paper/ieee_conference_paper.docx
@@ -18101,7 +18101,18 @@
         <w:t xml:space="preserve">Table XII</w:t>
       </w:r>
       <w:r>
-        <w:t xml:space="preserve"> reports the outcome of the collection window. It was attempted on Wednesday 28 October 2026 between 15:49 and 18:05 New York time: the pipeline ran (15 speed, 15 weather and 14 311 pulls, nine forecast batches written), but the public speed feed was never less than about 1 h 40 min behind, its newest Manhattan record moving from 11:31 to 14:11, 13:36 and 15:36 local time across the pulls, with one batch published, withdrawn and republished, so every batch withheld all 16 links (at most 5 of the 24 lookback bins observed against the 12 required) and the one-hour collection was not started. The run is therefore NOT RUN, the withholding rule was not relaxed, and the feed’s publication latency is itself an operational finding: on such a day the deployed system would have issued no forecast. A second attempt on Thursday 29 October (12:29 to 17:38 New York time, 25 pulls, 24 batches) found the same: the newest record moved from 10:11 to 15:36 local time and the lag never fell below about 1 h 50 min, so again no link reached the required history and the hour never started. Across the two afternoons the feed ran 1.7 to 4.3 h behind real time; under the preregistered rule a live forecast is therefore not reachable with the feed as it currently publishes, and any alternative (an origin at the newest available bin with its data age displayed, or a shorter lookback) would be a new preregistered protocol rather than a relaxation applied after the fact. Whatever a later run yields is a short window on one day, a check that the pipeline works on data that did not exist at training time, not a second test set.</w:t>
+        <w:t xml:space="preserve"> reports the outcome of the collection window. It was attempted on Wednesday 28 October 2026 between 15:49 and 18:05 New York time: the pipeline ran (15 speed, 15 weather and 14 311 pulls, nine forecast batches written), but the public speed feed was never less than about 1 h 40 min behind, its newest Manhattan record moving from 11:31 to 14:11, 13:36 and 15:36 local time across the pulls, with one batch published, withdrawn and republished, so every batch withheld all 16 links (at most 5 of the 24 lookback bins observed against the 12 required) and the one-hour collection was not started. The run is therefore NOT RUN, the withholding rule was not relaxed, and the feed’s publication latency is itself an operational finding: on such a day the deployed system would have issued no forecast. A second attempt on Thursday 29 October (12:29 to 17:38 New York time, 25 pulls, 24 batches) found the same: the newest record moved from 10:11 to 15:36 local time and the lag never fell below about 1 h 50 min, so again no link reached the required history and the hour never started. Across the two afternoons the feed ran 1.7 to 4.3 h behind real time; under the preregistered rule a live forecast is therefore not reachable with the feed as it currently publishes, and any alternative (an origin at the newest available bin with its data age displayed, or a shorter lookback) would be a new preregistered protocol rather than a relaxation applied after the fact. Following those two attempts, the latest-available variant was preregistered on 29 October 2026 (</w:t>
+      </w:r>
+      <w:r>
+        <w:rPr>
+          <w:rFonts w:ascii="Courier New" w:hAnsi="Courier New" w:cs="Courier New"/>
+          <w:sz w:val="18"/>
+          <w:szCs w:val="18"/>
+        </w:rPr>
+        <w:t xml:space="preserve">docs/​live_​latest_​available_​protocol.md</w:t>
+      </w:r>
+      <w:r>
+        <w:t xml:space="preserve">): the origin becomes the newest bin the feed has published, the lookback rule, model, intervals and scoring are unchanged, the data age at issue is stored on every forecast, and a target is scored only when the retrieval log shows its bin was first pulled after the forecast was written. Its outcome, if it runs, is a forecast of bins the feed had not yet published, with a stated data age of one to several hours, and is reported as such; it is NOT RUN at the time of writing. Whatever a later run yields is a short window on one day, a check that the pipeline works on data that did not exist at training time, not a second test set.</w:t>
       </w:r>
     </w:p>
     <w:p>

</xml_diff>

<commit_message>
Word paper: latest-available live result, Table XII and future work
Co-Authored-By: Claude Opus 5.5 <noreply@anthropic.com>
Claude-Session: https://claude.ai/code/session_01UKAyPjXQRWjVWPVDNV1WWD
</commit_message>
<xml_diff>
--- a/paper/ieee_conference_paper.docx
+++ b/paper/ieee_conference_paper.docx
@@ -18112,7 +18112,34 @@
         <w:t xml:space="preserve">docs/​live_​latest_​available_​protocol.md</w:t>
       </w:r>
       <w:r>
-        <w:t xml:space="preserve">): the origin becomes the newest bin the feed has published, the lookback rule, model, intervals and scoring are unchanged, the data age at issue is stored on every forecast, and a target is scored only when the retrieval log shows its bin was first pulled after the forecast was written. Its outcome, if it runs, is a forecast of bins the feed had not yet published, with a stated data age of one to several hours, and is reported as such; it is NOT RUN at the time of writing. Whatever a later run yields is a short window on one day, a check that the pipeline works on data that did not exist at training time, not a second test set.</w:t>
+        <w:t xml:space="preserve">): the origin becomes the newest bin the feed has published, the lookback rule, model, intervals and scoring are unchanged, the data age at issue is stored on every forecast, and a target is scored only when the retrieval log shows its bin was first pulled after the forecast was written. It was run on Friday 30 October 2026 between 12:06 and 15:15 New York time (branch </w:t>
+      </w:r>
+      <w:r>
+        <w:rPr>
+          <w:rFonts w:ascii="Courier New" w:hAnsi="Courier New" w:cs="Courier New"/>
+          <w:sz w:val="18"/>
+          <w:szCs w:val="18"/>
+        </w:rPr>
+        <w:t xml:space="preserve">claude/​laptop-live</w:t>
+      </w:r>
+      <w:r>
+        <w:t xml:space="preserve">, 24 polls at five-minute intervals, then a settle phase until the bin after the last 60-minute target was published). The feed published new bins only twice during the two hours, so three batches were written, with origins 13:40, 14:55 and 16:05 UTC that were 148, 89 and 104 min old when the forecast was issued (mean 114 min); each batch forecast 13 of the 16 links and withheld three that had no recent record. All 117 forecasts were scored (0 pending, 0 late) and none was excluded by the publication-time guard: every forecast was written before its target bin was published, although, because of the feed’s latency, every target had already occurred on the wall clock. On these newly published records (</w:t>
+      </w:r>
+      <w:r>
+        <w:t xml:space="preserve">Table XII</w:t>
+      </w:r>
+      <w:r>
+        <w:t xml:space="preserve">, </w:t>
+      </w:r>
+      <w:r>
+        <w:rPr>
+          <w:i/>
+          <w:iCs/>
+        </w:rPr>
+        <w:t xml:space="preserve">n</w:t>
+      </w:r>
+      <w:r>
+        <w:t xml:space="preserve"> = 39 per horizon) the frozen model’s MAE was 3.62, 5.50 and 5.25 mph at 15, 30 and 60 min against persistence at 4.25, 6.17 and 5.59 mph, with 90% interval coverage of 0.897, 0.872 and 0.923 (widths 22 to 27 mph); on the 30 advisory-eligible rows per horizon the MAE was 3.96, 5.14 and 4.65 mph. This is a forecast at the feed’s own latency, of bins the feed had not yet released, reported with its data age and not as a real-time prediction; three origins on one afternoon are a check that the pipeline works on data that did not exist at training time, not a second test set, and the wall-clock protocol remains NOT RUN.</w:t>
       </w:r>
     </w:p>
     <w:p>
@@ -18126,7 +18153,7 @@
     </w:p>
     <w:tbl>
       <w:tblPr>
-        <w:tblW w:w="180.00pt" w:type="dxa"/>
+        <w:tblW w:w="243.30pt" w:type="dxa"/>
         <w:jc w:val="center"/>
         <w:tblBorders>
           <w:top w:val="single" w:sz="2" w:space="0" w:color="auto"/>
@@ -18144,7 +18171,12 @@
         <w:tblLook w:firstRow="1" w:lastRow="0" w:firstColumn="0" w:lastColumn="0" w:noHBand="1" w:noVBand="1"/>
       </w:tblPr>
       <w:tblGrid>
-        <w:gridCol w:w="3600"/>
+        <w:gridCol w:w="811"/>
+        <w:gridCol w:w="811"/>
+        <w:gridCol w:w="811"/>
+        <w:gridCol w:w="811"/>
+        <w:gridCol w:w="811"/>
+        <w:gridCol w:w="811"/>
       </w:tblGrid>
       <w:tr>
         <w:trPr>
@@ -18154,7 +18186,7 @@
         </w:trPr>
         <w:tc>
           <w:tcPr>
-            <w:tcW w:w="180.00pt" w:type="dxa"/>
+            <w:tcW w:w="40.55pt" w:type="dxa"/>
             <w:vAlign w:val="center"/>
           </w:tcPr>
           <w:p>
@@ -18167,10 +18199,120 @@
               <w:rPr>
                 <w:b/>
                 <w:bCs/>
-                <w:sz w:val="16"/>
-                <w:szCs w:val="16"/>
-              </w:rPr>
-              <w:t xml:space="preserve">Status</w:t>
+                <w:sz w:val="13"/>
+                <w:szCs w:val="13"/>
+              </w:rPr>
+              <w:t xml:space="preserve">Horizon (min)</w:t>
+            </w:r>
+          </w:p>
+        </w:tc>
+        <w:tc>
+          <w:tcPr>
+            <w:tcW w:w="40.55pt" w:type="dxa"/>
+            <w:vAlign w:val="center"/>
+          </w:tcPr>
+          <w:p>
+            <w:pPr>
+              <w:pStyle w:val="tablecolhead"/>
+              <w:keepNext/>
+              <w:jc w:val="center"/>
+            </w:pPr>
+            <w:r>
+              <w:rPr>
+                <w:b/>
+                <w:bCs/>
+                <w:sz w:val="13"/>
+                <w:szCs w:val="13"/>
+              </w:rPr>
+              <w:t xml:space="preserve">Scored</w:t>
+            </w:r>
+          </w:p>
+        </w:tc>
+        <w:tc>
+          <w:tcPr>
+            <w:tcW w:w="40.55pt" w:type="dxa"/>
+            <w:vAlign w:val="center"/>
+          </w:tcPr>
+          <w:p>
+            <w:pPr>
+              <w:pStyle w:val="tablecolhead"/>
+              <w:keepNext/>
+              <w:jc w:val="center"/>
+            </w:pPr>
+            <w:r>
+              <w:rPr>
+                <w:b/>
+                <w:bCs/>
+                <w:sz w:val="13"/>
+                <w:szCs w:val="13"/>
+              </w:rPr>
+              <w:t xml:space="preserve">MAE (mph)</w:t>
+            </w:r>
+          </w:p>
+        </w:tc>
+        <w:tc>
+          <w:tcPr>
+            <w:tcW w:w="40.55pt" w:type="dxa"/>
+            <w:vAlign w:val="center"/>
+          </w:tcPr>
+          <w:p>
+            <w:pPr>
+              <w:pStyle w:val="tablecolhead"/>
+              <w:keepNext/>
+              <w:jc w:val="center"/>
+            </w:pPr>
+            <w:r>
+              <w:rPr>
+                <w:b/>
+                <w:bCs/>
+                <w:sz w:val="13"/>
+                <w:szCs w:val="13"/>
+              </w:rPr>
+              <w:t xml:space="preserve">Persistence MAE</w:t>
+            </w:r>
+          </w:p>
+        </w:tc>
+        <w:tc>
+          <w:tcPr>
+            <w:tcW w:w="40.55pt" w:type="dxa"/>
+            <w:vAlign w:val="center"/>
+          </w:tcPr>
+          <w:p>
+            <w:pPr>
+              <w:pStyle w:val="tablecolhead"/>
+              <w:keepNext/>
+              <w:jc w:val="center"/>
+            </w:pPr>
+            <w:r>
+              <w:rPr>
+                <w:b/>
+                <w:bCs/>
+                <w:sz w:val="13"/>
+                <w:szCs w:val="13"/>
+              </w:rPr>
+              <w:t xml:space="preserve">Coverage</w:t>
+            </w:r>
+          </w:p>
+        </w:tc>
+        <w:tc>
+          <w:tcPr>
+            <w:tcW w:w="40.55pt" w:type="dxa"/>
+            <w:vAlign w:val="center"/>
+          </w:tcPr>
+          <w:p>
+            <w:pPr>
+              <w:pStyle w:val="tablecolhead"/>
+              <w:keepNext/>
+              <w:jc w:val="center"/>
+            </w:pPr>
+            <w:r>
+              <w:rPr>
+                <w:b/>
+                <w:bCs/>
+                <w:sz w:val="13"/>
+                <w:szCs w:val="13"/>
+              </w:rPr>
+              <w:t xml:space="preserve">Width (mph)</w:t>
             </w:r>
           </w:p>
         </w:tc>
@@ -18182,20 +18324,367 @@
         </w:trPr>
         <w:tc>
           <w:tcPr>
-            <w:tcW w:w="180.00pt" w:type="dxa"/>
-            <w:vAlign w:val="center"/>
-          </w:tcPr>
-          <w:p>
-            <w:pPr>
-              <w:pStyle w:val="tablecopy"/>
-              <w:jc w:val="center"/>
-            </w:pPr>
-            <w:r>
-              <w:rPr>
-                <w:sz w:val="16"/>
-                <w:szCs w:val="16"/>
-              </w:rPr>
-              <w:t xml:space="preserve">NOT RUN</w:t>
+            <w:tcW w:w="40.55pt" w:type="dxa"/>
+            <w:vAlign w:val="center"/>
+          </w:tcPr>
+          <w:p>
+            <w:pPr>
+              <w:pStyle w:val="tablecopy"/>
+              <w:keepNext/>
+              <w:jc w:val="start"/>
+            </w:pPr>
+            <w:r>
+              <w:rPr>
+                <w:sz w:val="13"/>
+                <w:szCs w:val="13"/>
+              </w:rPr>
+              <w:t xml:space="preserve">15</w:t>
+            </w:r>
+          </w:p>
+        </w:tc>
+        <w:tc>
+          <w:tcPr>
+            <w:tcW w:w="40.55pt" w:type="dxa"/>
+            <w:vAlign w:val="center"/>
+          </w:tcPr>
+          <w:p>
+            <w:pPr>
+              <w:pStyle w:val="tablecopy"/>
+              <w:keepNext/>
+              <w:jc w:val="center"/>
+            </w:pPr>
+            <w:r>
+              <w:rPr>
+                <w:sz w:val="13"/>
+                <w:szCs w:val="13"/>
+              </w:rPr>
+              <w:t xml:space="preserve">39</w:t>
+            </w:r>
+          </w:p>
+        </w:tc>
+        <w:tc>
+          <w:tcPr>
+            <w:tcW w:w="40.55pt" w:type="dxa"/>
+            <w:vAlign w:val="center"/>
+          </w:tcPr>
+          <w:p>
+            <w:pPr>
+              <w:pStyle w:val="tablecopy"/>
+              <w:keepNext/>
+              <w:jc w:val="center"/>
+            </w:pPr>
+            <w:r>
+              <w:rPr>
+                <w:sz w:val="13"/>
+                <w:szCs w:val="13"/>
+              </w:rPr>
+              <w:t xml:space="preserve">3.62</w:t>
+            </w:r>
+          </w:p>
+        </w:tc>
+        <w:tc>
+          <w:tcPr>
+            <w:tcW w:w="40.55pt" w:type="dxa"/>
+            <w:vAlign w:val="center"/>
+          </w:tcPr>
+          <w:p>
+            <w:pPr>
+              <w:pStyle w:val="tablecopy"/>
+              <w:keepNext/>
+              <w:jc w:val="center"/>
+            </w:pPr>
+            <w:r>
+              <w:rPr>
+                <w:sz w:val="13"/>
+                <w:szCs w:val="13"/>
+              </w:rPr>
+              <w:t xml:space="preserve">4.25</w:t>
+            </w:r>
+          </w:p>
+        </w:tc>
+        <w:tc>
+          <w:tcPr>
+            <w:tcW w:w="40.55pt" w:type="dxa"/>
+            <w:vAlign w:val="center"/>
+          </w:tcPr>
+          <w:p>
+            <w:pPr>
+              <w:pStyle w:val="tablecopy"/>
+              <w:keepNext/>
+              <w:jc w:val="center"/>
+            </w:pPr>
+            <w:r>
+              <w:rPr>
+                <w:sz w:val="13"/>
+                <w:szCs w:val="13"/>
+              </w:rPr>
+              <w:t xml:space="preserve">0.897</w:t>
+            </w:r>
+          </w:p>
+        </w:tc>
+        <w:tc>
+          <w:tcPr>
+            <w:tcW w:w="40.55pt" w:type="dxa"/>
+            <w:vAlign w:val="center"/>
+          </w:tcPr>
+          <w:p>
+            <w:pPr>
+              <w:pStyle w:val="tablecopy"/>
+              <w:keepNext/>
+              <w:jc w:val="center"/>
+            </w:pPr>
+            <w:r>
+              <w:rPr>
+                <w:sz w:val="13"/>
+                <w:szCs w:val="13"/>
+              </w:rPr>
+              <w:t xml:space="preserve">21.9</w:t>
+            </w:r>
+          </w:p>
+        </w:tc>
+      </w:tr>
+      <w:tr>
+        <w:trPr>
+          <w:cantSplit/>
+          <w:jc w:val="center"/>
+        </w:trPr>
+        <w:tc>
+          <w:tcPr>
+            <w:tcW w:w="40.55pt" w:type="dxa"/>
+            <w:vAlign w:val="center"/>
+          </w:tcPr>
+          <w:p>
+            <w:pPr>
+              <w:pStyle w:val="tablecopy"/>
+              <w:keepNext/>
+              <w:jc w:val="start"/>
+            </w:pPr>
+            <w:r>
+              <w:rPr>
+                <w:sz w:val="13"/>
+                <w:szCs w:val="13"/>
+              </w:rPr>
+              <w:t xml:space="preserve">30</w:t>
+            </w:r>
+          </w:p>
+        </w:tc>
+        <w:tc>
+          <w:tcPr>
+            <w:tcW w:w="40.55pt" w:type="dxa"/>
+            <w:vAlign w:val="center"/>
+          </w:tcPr>
+          <w:p>
+            <w:pPr>
+              <w:pStyle w:val="tablecopy"/>
+              <w:keepNext/>
+              <w:jc w:val="center"/>
+            </w:pPr>
+            <w:r>
+              <w:rPr>
+                <w:sz w:val="13"/>
+                <w:szCs w:val="13"/>
+              </w:rPr>
+              <w:t xml:space="preserve">39</w:t>
+            </w:r>
+          </w:p>
+        </w:tc>
+        <w:tc>
+          <w:tcPr>
+            <w:tcW w:w="40.55pt" w:type="dxa"/>
+            <w:vAlign w:val="center"/>
+          </w:tcPr>
+          <w:p>
+            <w:pPr>
+              <w:pStyle w:val="tablecopy"/>
+              <w:keepNext/>
+              <w:jc w:val="center"/>
+            </w:pPr>
+            <w:r>
+              <w:rPr>
+                <w:sz w:val="13"/>
+                <w:szCs w:val="13"/>
+              </w:rPr>
+              <w:t xml:space="preserve">5.50</w:t>
+            </w:r>
+          </w:p>
+        </w:tc>
+        <w:tc>
+          <w:tcPr>
+            <w:tcW w:w="40.55pt" w:type="dxa"/>
+            <w:vAlign w:val="center"/>
+          </w:tcPr>
+          <w:p>
+            <w:pPr>
+              <w:pStyle w:val="tablecopy"/>
+              <w:keepNext/>
+              <w:jc w:val="center"/>
+            </w:pPr>
+            <w:r>
+              <w:rPr>
+                <w:sz w:val="13"/>
+                <w:szCs w:val="13"/>
+              </w:rPr>
+              <w:t xml:space="preserve">6.17</w:t>
+            </w:r>
+          </w:p>
+        </w:tc>
+        <w:tc>
+          <w:tcPr>
+            <w:tcW w:w="40.55pt" w:type="dxa"/>
+            <w:vAlign w:val="center"/>
+          </w:tcPr>
+          <w:p>
+            <w:pPr>
+              <w:pStyle w:val="tablecopy"/>
+              <w:keepNext/>
+              <w:jc w:val="center"/>
+            </w:pPr>
+            <w:r>
+              <w:rPr>
+                <w:sz w:val="13"/>
+                <w:szCs w:val="13"/>
+              </w:rPr>
+              <w:t xml:space="preserve">0.872</w:t>
+            </w:r>
+          </w:p>
+        </w:tc>
+        <w:tc>
+          <w:tcPr>
+            <w:tcW w:w="40.55pt" w:type="dxa"/>
+            <w:vAlign w:val="center"/>
+          </w:tcPr>
+          <w:p>
+            <w:pPr>
+              <w:pStyle w:val="tablecopy"/>
+              <w:keepNext/>
+              <w:jc w:val="center"/>
+            </w:pPr>
+            <w:r>
+              <w:rPr>
+                <w:sz w:val="13"/>
+                <w:szCs w:val="13"/>
+              </w:rPr>
+              <w:t xml:space="preserve">24.9</w:t>
+            </w:r>
+          </w:p>
+        </w:tc>
+      </w:tr>
+      <w:tr>
+        <w:trPr>
+          <w:cantSplit/>
+          <w:jc w:val="center"/>
+        </w:trPr>
+        <w:tc>
+          <w:tcPr>
+            <w:tcW w:w="40.55pt" w:type="dxa"/>
+            <w:vAlign w:val="center"/>
+          </w:tcPr>
+          <w:p>
+            <w:pPr>
+              <w:pStyle w:val="tablecopy"/>
+              <w:jc w:val="start"/>
+            </w:pPr>
+            <w:r>
+              <w:rPr>
+                <w:sz w:val="13"/>
+                <w:szCs w:val="13"/>
+              </w:rPr>
+              <w:t xml:space="preserve">60</w:t>
+            </w:r>
+          </w:p>
+        </w:tc>
+        <w:tc>
+          <w:tcPr>
+            <w:tcW w:w="40.55pt" w:type="dxa"/>
+            <w:vAlign w:val="center"/>
+          </w:tcPr>
+          <w:p>
+            <w:pPr>
+              <w:pStyle w:val="tablecopy"/>
+              <w:jc w:val="center"/>
+            </w:pPr>
+            <w:r>
+              <w:rPr>
+                <w:sz w:val="13"/>
+                <w:szCs w:val="13"/>
+              </w:rPr>
+              <w:t xml:space="preserve">39</w:t>
+            </w:r>
+          </w:p>
+        </w:tc>
+        <w:tc>
+          <w:tcPr>
+            <w:tcW w:w="40.55pt" w:type="dxa"/>
+            <w:vAlign w:val="center"/>
+          </w:tcPr>
+          <w:p>
+            <w:pPr>
+              <w:pStyle w:val="tablecopy"/>
+              <w:jc w:val="center"/>
+            </w:pPr>
+            <w:r>
+              <w:rPr>
+                <w:sz w:val="13"/>
+                <w:szCs w:val="13"/>
+              </w:rPr>
+              <w:t xml:space="preserve">5.25</w:t>
+            </w:r>
+          </w:p>
+        </w:tc>
+        <w:tc>
+          <w:tcPr>
+            <w:tcW w:w="40.55pt" w:type="dxa"/>
+            <w:vAlign w:val="center"/>
+          </w:tcPr>
+          <w:p>
+            <w:pPr>
+              <w:pStyle w:val="tablecopy"/>
+              <w:jc w:val="center"/>
+            </w:pPr>
+            <w:r>
+              <w:rPr>
+                <w:sz w:val="13"/>
+                <w:szCs w:val="13"/>
+              </w:rPr>
+              <w:t xml:space="preserve">5.59</w:t>
+            </w:r>
+          </w:p>
+        </w:tc>
+        <w:tc>
+          <w:tcPr>
+            <w:tcW w:w="40.55pt" w:type="dxa"/>
+            <w:vAlign w:val="center"/>
+          </w:tcPr>
+          <w:p>
+            <w:pPr>
+              <w:pStyle w:val="tablecopy"/>
+              <w:jc w:val="center"/>
+            </w:pPr>
+            <w:r>
+              <w:rPr>
+                <w:sz w:val="13"/>
+                <w:szCs w:val="13"/>
+              </w:rPr>
+              <w:t xml:space="preserve">0.923</w:t>
+            </w:r>
+          </w:p>
+        </w:tc>
+        <w:tc>
+          <w:tcPr>
+            <w:tcW w:w="40.55pt" w:type="dxa"/>
+            <w:vAlign w:val="center"/>
+          </w:tcPr>
+          <w:p>
+            <w:pPr>
+              <w:pStyle w:val="tablecopy"/>
+              <w:jc w:val="center"/>
+            </w:pPr>
+            <w:r>
+              <w:rPr>
+                <w:sz w:val="13"/>
+                <w:szCs w:val="13"/>
+              </w:rPr>
+              <w:t xml:space="preserve">27.3</w:t>
             </w:r>
           </w:p>
         </w:tc>
@@ -18203,6 +18692,28 @@
     </w:tbl>
     <w:p>
       <w:pPr>
+        <w:pStyle w:val="tablecopy"/>
+        <w:spacing w:before="3pt" w:after="8pt"/>
+      </w:pPr>
+      <w:r>
+        <w:rPr>
+          <w:i/>
+          <w:iCs/>
+          <w:sz w:val="14"/>
+          <w:szCs w:val="14"/>
+        </w:rPr>
+        <w:t xml:space="preserve">Note:</w:t>
+      </w:r>
+      <w:r>
+        <w:rPr>
+          <w:sz w:val="14"/>
+          <w:szCs w:val="14"/>
+        </w:rPr>
+        <w:t xml:space="preserve"> The frozen model was run on records pulled from the public speed feed between 2026-10-28T19:50 and 2026-10-30T16:05 UTC (16 links; 36 five-minute batches: 33 wall-clock batches on 2026-10-28, 2026-10-29 in which every link was withheld for insufficient history; 3 latest-available batches on 2026-10-30 that produced forecasts); the origin of each latest-available batch was the newest bin the feed had published, on average 114 min (at most 148 min) old when the forecast was written (latest-available protocol preregistered on 29 October 2026); every forecast was written before its target bin was published and scored only when that bin was first retrieved afterwards (0 rows excluded as published before issue; 117 scored targets already lay in the past on the wall clock). Persistence is the last observed speed at the origin. Pending targets (0) and late forecasts (0) are not scored. A short window on one weekday, not a second test set.</w:t>
+      </w:r>
+    </w:p>
+    <w:p>
+      <w:pPr>
         <w:pStyle w:val="Heading2"/>
       </w:pPr>
       <w:r>
@@ -18494,7 +19005,7 @@
         <w:pStyle w:val="BodyText"/>
       </w:pPr>
       <w:r>
-        <w:t xml:space="preserve">Future work, in the order the evidence suggests, is training with more seeds and without the compute budget, congestion-conditional calibration, a denser sensor network on which the spatial layer can matter, a testbed with side-street demand, NYC DOT timing plans and pedestrians, the live observational run, and an externally reviewed retrieval benchmark.</w:t>
+        <w:t xml:space="preserve">Future work, in the order the evidence suggests, is training with more seeds and without the compute budget, congestion-conditional calibration, a denser sensor network on which the spatial layer can matter, a testbed with side-street demand, NYC DOT timing plans and pedestrians, a longer live observational window (the one afternoon run beat persistence at every horizon at a data age of about two hours), and an externally reviewed retrieval benchmark.</w:t>
       </w:r>
     </w:p>
     <w:p>

</xml_diff>